<commit_message>
Document the report and its export routes
Adds the report requirements and export verification to the functional
document, the export design and plugin dependency to the technical document,
and the plugin prerequisite to the migration runbook. Regenerates the DOCX
copies.

Co-authored-by: paladuguraj <paladuguraj@users.noreply.github.com>
</commit_message>
<xml_diff>
--- a/docs/CSAT Survey Portal - Migration Runbook.docx
+++ b/docs/CSAT Survey Portal - Migration Runbook.docx
@@ -2,38 +2,6 @@
 <file path=word/document.xml><?xml version="1.0" encoding="utf-8"?>
 <w:document xmlns:w="http://schemas.openxmlformats.org/wordprocessingml/2006/main" xmlns:m="http://schemas.openxmlformats.org/officeDocument/2006/math" xmlns:r="http://schemas.openxmlformats.org/officeDocument/2006/relationships" xmlns:o="urn:schemas-microsoft-com:office:office" xmlns:v="urn:schemas-microsoft-com:vml" xmlns:w10="urn:schemas-microsoft-com:office:word" xmlns:a="http://schemas.openxmlformats.org/drawingml/2006/main" xmlns:pic="http://schemas.openxmlformats.org/drawingml/2006/picture" xmlns:wp="http://schemas.openxmlformats.org/drawingml/2006/wordprocessingDrawing">
   <w:body>
-    <w:p>
-      <w:pPr>
-        <w:pStyle w:val="Title"/>
-      </w:pPr>
-      <w:r>
-        <w:t xml:space="preserve">CSAT Survey Portal — Migration Runbook</w:t>
-      </w:r>
-    </w:p>
-    <w:p>
-      <w:pPr>
-        <w:pStyle w:val="Subtitle"/>
-      </w:pPr>
-      <w:r>
-        <w:t xml:space="preserve">Deploying to another ServiceNow instance · Version 1.0</w:t>
-      </w:r>
-    </w:p>
-    <w:p>
-      <w:pPr>
-        <w:pStyle w:val="Author"/>
-      </w:pPr>
-      <w:r>
-        <w:t xml:space="preserve">ServiceNow Delivery</w:t>
-      </w:r>
-    </w:p>
-    <w:p>
-      <w:pPr>
-        <w:pStyle w:val="Date"/>
-      </w:pPr>
-      <w:r>
-        <w:t xml:space="preserve">2026-08-05</w:t>
-      </w:r>
-    </w:p>
     <w:sdt>
       <w:sdtPr>
         <w:docPartObj>
@@ -60,6 +28,15 @@
         </w:p>
       </w:sdtContent>
     </w:sdt>
+    <w:bookmarkStart w:id="31" w:name="X47d3ed5a99bd92b08e0bc22d12ab79240fbfc78"/>
+    <w:p>
+      <w:pPr>
+        <w:pStyle w:val="Heading1"/>
+      </w:pPr>
+      <w:r>
+        <w:t xml:space="preserve">Moving the CSAT Survey Portal to another instance</w:t>
+      </w:r>
+    </w:p>
     <w:p>
       <w:pPr>
         <w:pStyle w:val="FirstParagraph"/>
@@ -115,7 +92,7 @@
         <w:t xml:space="preserve">so re-running is safe.</w:t>
       </w:r>
     </w:p>
-    <w:bookmarkStart w:id="20" w:name="Xd81a219a6b344c1ed740b0a4b7f4f2fdcc048dd"/>
+    <w:bookmarkStart w:id="20" w:name="point-at-the-target-instance"/>
     <w:p>
       <w:pPr>
         <w:pStyle w:val="Heading2"/>
@@ -365,7 +342,7 @@
       </w:r>
     </w:p>
     <w:bookmarkEnd w:id="20"/>
-    <w:bookmarkStart w:id="21" w:name="X36f5cbc20cbaaf0ac0ec4cf8586bd2f9f1bb44c"/>
+    <w:bookmarkStart w:id="21" w:name="check-the-target-can-host-it"/>
     <w:p>
       <w:pPr>
         <w:pStyle w:val="Heading2"/>
@@ -402,13 +379,13 @@
     <w:tbl>
       <w:tblPr>
         <w:tblStyle w:val="Table"/>
-        <w:tblW w:type="auto" w:w="0"/>
+        <w:tblW w:type="pct" w:w="5000"/>
         <w:tblLook w:firstRow="1" w:lastRow="0" w:firstColumn="0" w:lastColumn="0" w:noHBand="0" w:noVBand="0" w:val="0020"/>
         <w:jc w:val="start"/>
       </w:tblPr>
       <w:tblGrid>
-        <w:gridCol w:w="3960"/>
-        <w:gridCol w:w="3960"/>
+        <w:gridCol w:w="2410"/>
+        <w:gridCol w:w="5509"/>
       </w:tblGrid>
       <w:tr>
         <w:trPr>
@@ -539,7 +516,19 @@
               <w:jc w:val="left"/>
             </w:pPr>
             <w:r>
-              <w:t xml:space="preserve">"Survey Invitation" notification</w:t>
+              <w:t xml:space="preserve">“</w:t>
+            </w:r>
+            <w:r>
+              <w:t xml:space="preserve">Survey Invitation</w:t>
+            </w:r>
+            <w:r>
+              <w:t xml:space="preserve">”</w:t>
+            </w:r>
+            <w:r>
+              <w:t xml:space="preserve"> </w:t>
+            </w:r>
+            <w:r>
+              <w:t xml:space="preserve">notification</w:t>
             </w:r>
           </w:p>
         </w:tc>
@@ -622,7 +611,7 @@
       </w:tr>
     </w:tbl>
     <w:bookmarkEnd w:id="21"/>
-    <w:bookmarkStart w:id="22" w:name="X72d1bc437f5833d98491002d810a695673ca4e1"/>
+    <w:bookmarkStart w:id="22" w:name="capture-the-work-in-an-update-set"/>
     <w:p>
       <w:pPr>
         <w:pStyle w:val="Heading2"/>
@@ -687,7 +676,7 @@
       </w:r>
     </w:p>
     <w:bookmarkEnd w:id="22"/>
-    <w:bookmarkStart w:id="23" w:name="Xe2e43bef1ae798da0f2ad5ecb6dc45953b7ac21"/>
+    <w:bookmarkStart w:id="23" w:name="deploy"/>
     <w:p>
       <w:pPr>
         <w:pStyle w:val="Heading2"/>
@@ -873,7 +862,7 @@
       </w:r>
     </w:p>
     <w:bookmarkEnd w:id="23"/>
-    <w:bookmarkStart w:id="24" w:name="Xf7238b825ab2a5365c6f3586ef1de5df2b9ad4d"/>
+    <w:bookmarkStart w:id="24" w:name="close-the-update-set"/>
     <w:p>
       <w:pPr>
         <w:pStyle w:val="Heading2"/>
@@ -1060,7 +1049,7 @@
       </w:r>
     </w:p>
     <w:bookmarkEnd w:id="24"/>
-    <w:bookmarkStart w:id="25" w:name="Xc637cff25c9341ca31b030d8674669115fe9eda"/>
+    <w:bookmarkStart w:id="25" w:name="verify"/>
     <w:p>
       <w:pPr>
         <w:pStyle w:val="Heading2"/>
@@ -1138,7 +1127,25 @@
         <w:pStyle w:val="BodyText"/>
       </w:pPr>
       <w:r>
-        <w:t xml:space="preserve">The test sends to a single named recipient. Do not switch it to "all users" —</w:t>
+        <w:t xml:space="preserve">The test sends to a single named recipient. Do not switch it to</w:t>
+      </w:r>
+      <w:r>
+        <w:t xml:space="preserve"> </w:t>
+      </w:r>
+      <w:r>
+        <w:t xml:space="preserve">“</w:t>
+      </w:r>
+      <w:r>
+        <w:t xml:space="preserve">all users</w:t>
+      </w:r>
+      <w:r>
+        <w:t xml:space="preserve">”</w:t>
+      </w:r>
+      <w:r>
+        <w:t xml:space="preserve"> </w:t>
+      </w:r>
+      <w:r>
+        <w:t xml:space="preserve">—</w:t>
       </w:r>
       <w:r>
         <w:t xml:space="preserve"> </w:t>
@@ -1148,7 +1155,112 @@
       </w:r>
     </w:p>
     <w:bookmarkEnd w:id="25"/>
-    <w:bookmarkStart w:id="26" w:name="what-does-not-transfer"/>
+    <w:bookmarkStart w:id="26" w:name="X0186cabfc074ab94a715b7de2eaceed3001ccf8"/>
+    <w:p>
+      <w:pPr>
+        <w:pStyle w:val="Heading2"/>
+      </w:pPr>
+      <w:r>
+        <w:t xml:space="preserve">Plugin prerequisite for the report PDF export</w:t>
+      </w:r>
+    </w:p>
+    <w:p>
+      <w:pPr>
+        <w:pStyle w:val="FirstParagraph"/>
+      </w:pPr>
+      <w:r>
+        <w:t xml:space="preserve">The results report can export to PDF, Excel and CSV. Excel and CSV need nothing</w:t>
+      </w:r>
+      <w:r>
+        <w:t xml:space="preserve"> </w:t>
+      </w:r>
+      <w:r>
+        <w:t xml:space="preserve">beyond the platform; the PDF is rendered by</w:t>
+      </w:r>
+      <w:r>
+        <w:t xml:space="preserve"> </w:t>
+      </w:r>
+      <w:r>
+        <w:rPr>
+          <w:bCs/>
+          <w:b/>
+        </w:rPr>
+        <w:t xml:space="preserve">ServiceNow PDF Generation</w:t>
+      </w:r>
+      <w:r>
+        <w:rPr>
+          <w:bCs/>
+          <w:b/>
+        </w:rPr>
+        <w:t xml:space="preserve"> </w:t>
+      </w:r>
+      <w:r>
+        <w:rPr>
+          <w:bCs/>
+          <w:b/>
+        </w:rPr>
+        <w:t xml:space="preserve">Utilities</w:t>
+      </w:r>
+      <w:r>
+        <w:t xml:space="preserve"> </w:t>
+      </w:r>
+      <w:r>
+        <w:t xml:space="preserve">(</w:t>
+      </w:r>
+      <w:r>
+        <w:rPr>
+          <w:rStyle w:val="VerbatimChar"/>
+        </w:rPr>
+        <w:t xml:space="preserve">sn_pdfgeneratorutils</w:t>
+      </w:r>
+      <w:r>
+        <w:t xml:space="preserve">). Preflight reports whether it is active.</w:t>
+      </w:r>
+    </w:p>
+    <w:p>
+      <w:pPr>
+        <w:pStyle w:val="BodyText"/>
+      </w:pPr>
+      <w:r>
+        <w:t xml:space="preserve">If the plugin is inactive the report itself and the Excel and CSV exports still</w:t>
+      </w:r>
+      <w:r>
+        <w:t xml:space="preserve"> </w:t>
+      </w:r>
+      <w:r>
+        <w:t xml:space="preserve">work — only the PDF button returns an error — so this is a warning rather than a</w:t>
+      </w:r>
+      <w:r>
+        <w:t xml:space="preserve"> </w:t>
+      </w:r>
+      <w:r>
+        <w:t xml:space="preserve">blocker. Activate the plugin from</w:t>
+      </w:r>
+      <w:r>
+        <w:t xml:space="preserve"> </w:t>
+      </w:r>
+      <w:r>
+        <w:rPr>
+          <w:bCs/>
+          <w:b/>
+        </w:rPr>
+        <w:t xml:space="preserve">System Definition &gt; Plugins</w:t>
+      </w:r>
+      <w:r>
+        <w:t xml:space="preserve"> </w:t>
+      </w:r>
+      <w:r>
+        <w:t xml:space="preserve">on the target</w:t>
+      </w:r>
+      <w:r>
+        <w:t xml:space="preserve"> </w:t>
+      </w:r>
+      <w:r>
+        <w:t xml:space="preserve">if PDF export is required.</w:t>
+      </w:r>
+    </w:p>
+    <w:bookmarkEnd w:id="26"/>
+    <w:bookmarkStart w:id="27" w:name="what-does-not-transfer"/>
     <w:p>
       <w:pPr>
         <w:pStyle w:val="Heading2"/>
@@ -1332,8 +1444,8 @@
         <w:t xml:space="preserve">the API definition rather than hardcoding it.</w:t>
       </w:r>
     </w:p>
-    <w:bookmarkEnd w:id="26"/>
-    <w:bookmarkStart w:id="28" w:name="update-sets-on-adcomsolutionsdev"/>
+    <w:bookmarkEnd w:id="27"/>
+    <w:bookmarkStart w:id="29" w:name="update-sets-on-adcomsolutionsdev"/>
     <w:p>
       <w:pPr>
         <w:pStyle w:val="Heading2"/>
@@ -1345,7 +1457,7 @@
     <w:tbl>
       <w:tblPr>
         <w:tblStyle w:val="Table"/>
-        <w:tblW w:type="auto" w:w="0"/>
+        <w:tblW w:type="pct" w:w="5000"/>
         <w:tblLook w:firstRow="1" w:lastRow="0" w:firstColumn="0" w:lastColumn="0" w:noHBand="0" w:noVBand="0" w:val="0020"/>
         <w:jc w:val="start"/>
       </w:tblPr>
@@ -1802,7 +1914,7 @@
         <w:t xml:space="preserve">/export_update_set.do?sysparm_sys_id=b9379cd52b62cf1007a3fa95b891bf80</w:t>
       </w:r>
     </w:p>
-    <w:bookmarkStart w:id="27" w:name="why-consolidation-was-needed"/>
+    <w:bookmarkStart w:id="28" w:name="why-consolidation-was-needed"/>
     <w:p>
       <w:pPr>
         <w:pStyle w:val="Heading3"/>
@@ -1834,7 +1946,7 @@
         <w:pStyle w:val="Compact"/>
       </w:pPr>
       <w:r>
-        <w:t xml:space="preserve">Creating a scoped application switched the current set to that application's</w:t>
+        <w:t xml:space="preserve">Creating a scoped application switched the current set to that application’s</w:t>
       </w:r>
       <w:r>
         <w:t xml:space="preserve"> </w:t>
@@ -1924,9 +2036,9 @@
         <w:t xml:space="preserve">cannot be recreated on a target.</w:t>
       </w:r>
     </w:p>
-    <w:bookmarkEnd w:id="27"/>
     <w:bookmarkEnd w:id="28"/>
-    <w:bookmarkStart w:id="29" w:name="promoting-via-the-exported-update-set"/>
+    <w:bookmarkEnd w:id="29"/>
+    <w:bookmarkStart w:id="30" w:name="promoting-via-the-exported-update-set"/>
     <w:p>
       <w:pPr>
         <w:pStyle w:val="Heading2"/>
@@ -2054,7 +2166,8 @@
         <w:t xml:space="preserve">, or add the record manually.</w:t>
       </w:r>
     </w:p>
-    <w:bookmarkEnd w:id="29"/>
+    <w:bookmarkEnd w:id="30"/>
+    <w:bookmarkEnd w:id="31"/>
     <w:sectPr/>
   </w:body>
 </w:document>

</xml_diff>

<commit_message>
Document the single consolidated update set
Co-authored-by: paladuguraj <paladuguraj@users.noreply.github.com>
</commit_message>
<xml_diff>
--- a/docs/CSAT Survey Portal - Migration Runbook.docx
+++ b/docs/CSAT Survey Portal - Migration Runbook.docx
@@ -28,7 +28,7 @@
         </w:p>
       </w:sdtContent>
     </w:sdt>
-    <w:bookmarkStart w:id="31" w:name="X47d3ed5a99bd92b08e0bc22d12ab79240fbfc78"/>
+    <w:bookmarkStart w:id="33" w:name="X47d3ed5a99bd92b08e0bc22d12ab79240fbfc78"/>
     <w:p>
       <w:pPr>
         <w:pStyle w:val="Heading1"/>
@@ -1480,32 +1480,110 @@
       </w:r>
     </w:p>
     <w:bookmarkEnd w:id="27"/>
-    <w:bookmarkStart w:id="29" w:name="update-sets-on-adcomsolutionsdev"/>
+    <w:bookmarkStart w:id="32" w:name="the-update-set-to-move"/>
     <w:p>
       <w:pPr>
         <w:pStyle w:val="Heading2"/>
       </w:pPr>
       <w:r>
-        <w:t xml:space="preserve">Update sets on adcomsolutionsdev</w:t>
+        <w:t xml:space="preserve">The update set to move</w:t>
+      </w:r>
+    </w:p>
+    <w:p>
+      <w:pPr>
+        <w:pStyle w:val="FirstParagraph"/>
+      </w:pPr>
+      <w:r>
+        <w:t xml:space="preserve">There is one, and it is the only CSAT Survey Portal set left in</w:t>
+      </w:r>
+      <w:r>
+        <w:t xml:space="preserve"> </w:t>
+      </w:r>
+      <w:r>
+        <w:rPr>
+          <w:bCs/>
+          <w:b/>
+        </w:rPr>
+        <w:t xml:space="preserve">Complete</w:t>
+      </w:r>
+      <w:r>
+        <w:t xml:space="preserve"> </w:t>
+      </w:r>
+      <w:r>
+        <w:t xml:space="preserve">state on adcomsolutionsdev:</w:t>
+      </w:r>
+    </w:p>
+    <w:p>
+      <w:pPr>
+        <w:pStyle w:val="Heading3"/>
+      </w:pPr>
+      <w:bookmarkStart w:id="28" w:name="csat-survey-portal---all-changes-v2.0"/>
+      <w:r>
+        <w:t xml:space="preserve">CSAT Survey Portal - ALL CHANGES v2.0</w:t>
+      </w:r>
+      <w:bookmarkEnd w:id="28"/>
+    </w:p>
+    <w:p>
+      <w:pPr>
+        <w:pStyle w:val="BlockText"/>
+      </w:pPr>
+      <w:r>
+        <w:t xml:space="preserve">179 changes ·</w:t>
+      </w:r>
+      <w:r>
+        <w:t xml:space="preserve"> </w:t>
+      </w:r>
+      <w:r>
+        <w:rPr>
+          <w:rStyle w:val="VerbatimChar"/>
+        </w:rPr>
+        <w:t xml:space="preserve">cdf1ea853b7a8750c4e908ac24e45a64</w:t>
+      </w:r>
+    </w:p>
+    <w:p>
+      <w:pPr>
+        <w:pStyle w:val="FirstParagraph"/>
+      </w:pPr>
+      <w:r>
+        <w:t xml:space="preserve">It holds the whole solution as it stands: the portal and its three pages and</w:t>
+      </w:r>
+      <w:r>
+        <w:t xml:space="preserve"> </w:t>
+      </w:r>
+      <w:r>
+        <w:t xml:space="preserve">widgets, the three tables with their columns, labels and choice lists, the four</w:t>
+      </w:r>
+      <w:r>
+        <w:t xml:space="preserve"> </w:t>
+      </w:r>
+      <w:r>
+        <w:t xml:space="preserve">script includes, both business rules, the scheduled job, the event and</w:t>
+      </w:r>
+      <w:r>
+        <w:t xml:space="preserve"> </w:t>
+      </w:r>
+      <w:r>
+        <w:t xml:space="preserve">notifications, the mail scripts, the Scripted REST API, and both survey</w:t>
+      </w:r>
+      <w:r>
+        <w:t xml:space="preserve"> </w:t>
+      </w:r>
+      <w:r>
+        <w:t xml:space="preserve">definitions with their questions and answer choices.</w:t>
       </w:r>
     </w:p>
     <w:tbl>
       <w:tblPr>
         <w:tblStyle w:val="Table"/>
-        <w:tblW w:type="pct" w:w="5000"/>
-        <w:tblLook w:firstRow="1" w:lastRow="0" w:firstColumn="0" w:lastColumn="0" w:noHBand="0" w:noVBand="0" w:val="0020"/>
+        <w:tblW w:type="auto" w:w="0"/>
+        <w:tblLook w:firstRow="0" w:lastRow="0" w:firstColumn="0" w:lastColumn="0" w:noHBand="0" w:noVBand="0" w:val="0000"/>
         <w:jc w:val="start"/>
       </w:tblPr>
       <w:tblGrid>
-        <w:gridCol w:w="1980"/>
-        <w:gridCol w:w="1980"/>
-        <w:gridCol w:w="1980"/>
-        <w:gridCol w:w="1980"/>
+        <w:gridCol w:w="3960"/>
+        <w:gridCol w:w="3960"/>
       </w:tblGrid>
       <w:tr>
-        <w:trPr>
-          <w:tblHeader w:val="true"/>
-        </w:trPr>
         <w:tc>
           <w:tcPr/>
           <w:p>
@@ -1514,7 +1592,7 @@
               <w:jc w:val="left"/>
             </w:pPr>
             <w:r>
-              <w:t xml:space="preserve">Set</w:t>
+              <w:t xml:space="preserve">Application menu and modules</w:t>
             </w:r>
           </w:p>
         </w:tc>
@@ -1526,31 +1604,7 @@
               <w:jc w:val="left"/>
             </w:pPr>
             <w:r>
-              <w:t xml:space="preserve">Changes</w:t>
-            </w:r>
-          </w:p>
-        </w:tc>
-        <w:tc>
-          <w:tcPr/>
-          <w:p>
-            <w:pPr>
-              <w:pStyle w:val="Compact"/>
-              <w:jc w:val="left"/>
-            </w:pPr>
-            <w:r>
-              <w:t xml:space="preserve">State</w:t>
-            </w:r>
-          </w:p>
-        </w:tc>
-        <w:tc>
-          <w:tcPr/>
-          <w:p>
-            <w:pPr>
-              <w:pStyle w:val="Compact"/>
-              <w:jc w:val="left"/>
-            </w:pPr>
-            <w:r>
-              <w:t xml:space="preserve">Migrate?</w:t>
+              <w:t xml:space="preserve">3</w:t>
             </w:r>
           </w:p>
         </w:tc>
@@ -1564,11 +1618,7 @@
               <w:jc w:val="left"/>
             </w:pPr>
             <w:r>
-              <w:rPr>
-                <w:bCs/>
-                <w:b/>
-              </w:rPr>
-              <w:t xml:space="preserve">CSAT Survey Portal - COMPLETE v1.0</w:t>
+              <w:t xml:space="preserve">Tables, columns, labels, choices</w:t>
             </w:r>
           </w:p>
         </w:tc>
@@ -1580,39 +1630,7 @@
               <w:jc w:val="left"/>
             </w:pPr>
             <w:r>
-              <w:rPr>
-                <w:bCs/>
-                <w:b/>
-              </w:rPr>
-              <w:t xml:space="preserve">177</w:t>
-            </w:r>
-          </w:p>
-        </w:tc>
-        <w:tc>
-          <w:tcPr/>
-          <w:p>
-            <w:pPr>
-              <w:pStyle w:val="Compact"/>
-              <w:jc w:val="left"/>
-            </w:pPr>
-            <w:r>
-              <w:t xml:space="preserve">Complete</w:t>
-            </w:r>
-          </w:p>
-        </w:tc>
-        <w:tc>
-          <w:tcPr/>
-          <w:p>
-            <w:pPr>
-              <w:pStyle w:val="Compact"/>
-              <w:jc w:val="left"/>
-            </w:pPr>
-            <w:r>
-              <w:rPr>
-                <w:bCs/>
-                <w:b/>
-              </w:rPr>
-              <w:t xml:space="preserve">Yes — this one</w:t>
+              <w:t xml:space="preserve">57</w:t>
             </w:r>
           </w:p>
         </w:tc>
@@ -1626,7 +1644,7 @@
               <w:jc w:val="left"/>
             </w:pPr>
             <w:r>
-              <w:t xml:space="preserve">CSAT Survey Portal</w:t>
+              <w:t xml:space="preserve">Script includes</w:t>
             </w:r>
           </w:p>
         </w:tc>
@@ -1638,31 +1656,7 @@
               <w:jc w:val="left"/>
             </w:pPr>
             <w:r>
-              <w:t xml:space="preserve">0</w:t>
-            </w:r>
-          </w:p>
-        </w:tc>
-        <w:tc>
-          <w:tcPr/>
-          <w:p>
-            <w:pPr>
-              <w:pStyle w:val="Compact"/>
-              <w:jc w:val="left"/>
-            </w:pPr>
-            <w:r>
-              <w:t xml:space="preserve">Ignore</w:t>
-            </w:r>
-          </w:p>
-        </w:tc>
-        <w:tc>
-          <w:tcPr/>
-          <w:p>
-            <w:pPr>
-              <w:pStyle w:val="Compact"/>
-              <w:jc w:val="left"/>
-            </w:pPr>
-            <w:r>
-              <w:t xml:space="preserve">No</w:t>
+              <w:t xml:space="preserve">4</w:t>
             </w:r>
           </w:p>
         </w:tc>
@@ -1676,7 +1670,7 @@
               <w:jc w:val="left"/>
             </w:pPr>
             <w:r>
-              <w:t xml:space="preserve">CSAT Survey Portal - Tweaks</w:t>
+              <w:t xml:space="preserve">Business rules</w:t>
             </w:r>
           </w:p>
         </w:tc>
@@ -1688,31 +1682,7 @@
               <w:jc w:val="left"/>
             </w:pPr>
             <w:r>
-              <w:t xml:space="preserve">0</w:t>
-            </w:r>
-          </w:p>
-        </w:tc>
-        <w:tc>
-          <w:tcPr/>
-          <w:p>
-            <w:pPr>
-              <w:pStyle w:val="Compact"/>
-              <w:jc w:val="left"/>
-            </w:pPr>
-            <w:r>
-              <w:t xml:space="preserve">Ignore</w:t>
-            </w:r>
-          </w:p>
-        </w:tc>
-        <w:tc>
-          <w:tcPr/>
-          <w:p>
-            <w:pPr>
-              <w:pStyle w:val="Compact"/>
-              <w:jc w:val="left"/>
-            </w:pPr>
-            <w:r>
-              <w:t xml:space="preserve">No</w:t>
+              <w:t xml:space="preserve">2</w:t>
             </w:r>
           </w:p>
         </w:tc>
@@ -1726,7 +1696,7 @@
               <w:jc w:val="left"/>
             </w:pPr>
             <w:r>
-              <w:t xml:space="preserve">CSAT Survey Portal - Draft guard</w:t>
+              <w:t xml:space="preserve">Scheduled job</w:t>
             </w:r>
           </w:p>
         </w:tc>
@@ -1738,31 +1708,7 @@
               <w:jc w:val="left"/>
             </w:pPr>
             <w:r>
-              <w:t xml:space="preserve">0</w:t>
-            </w:r>
-          </w:p>
-        </w:tc>
-        <w:tc>
-          <w:tcPr/>
-          <w:p>
-            <w:pPr>
-              <w:pStyle w:val="Compact"/>
-              <w:jc w:val="left"/>
-            </w:pPr>
-            <w:r>
-              <w:t xml:space="preserve">Ignore</w:t>
-            </w:r>
-          </w:p>
-        </w:tc>
-        <w:tc>
-          <w:tcPr/>
-          <w:p>
-            <w:pPr>
-              <w:pStyle w:val="Compact"/>
-              <w:jc w:val="left"/>
-            </w:pPr>
-            <w:r>
-              <w:t xml:space="preserve">No</w:t>
+              <w:t xml:space="preserve">1</w:t>
             </w:r>
           </w:p>
         </w:tc>
@@ -1776,7 +1722,7 @@
               <w:jc w:val="left"/>
             </w:pPr>
             <w:r>
-              <w:t xml:space="preserve">CSAT Survey Portal - Recipient picker</w:t>
+              <w:t xml:space="preserve">Event and notifications</w:t>
             </w:r>
           </w:p>
         </w:tc>
@@ -1788,31 +1734,7 @@
               <w:jc w:val="left"/>
             </w:pPr>
             <w:r>
-              <w:t xml:space="preserve">0</w:t>
-            </w:r>
-          </w:p>
-        </w:tc>
-        <w:tc>
-          <w:tcPr/>
-          <w:p>
-            <w:pPr>
-              <w:pStyle w:val="Compact"/>
-              <w:jc w:val="left"/>
-            </w:pPr>
-            <w:r>
-              <w:t xml:space="preserve">Ignore</w:t>
-            </w:r>
-          </w:p>
-        </w:tc>
-        <w:tc>
-          <w:tcPr/>
-          <w:p>
-            <w:pPr>
-              <w:pStyle w:val="Compact"/>
-              <w:jc w:val="left"/>
-            </w:pPr>
-            <w:r>
-              <w:t xml:space="preserve">No</w:t>
+              <w:t xml:space="preserve">7</w:t>
             </w:r>
           </w:p>
         </w:tc>
@@ -1826,7 +1748,7 @@
               <w:jc w:val="left"/>
             </w:pPr>
             <w:r>
-              <w:t xml:space="preserve">CSAT Survey Portal - View request button</w:t>
+              <w:t xml:space="preserve">Mail scripts</w:t>
             </w:r>
           </w:p>
         </w:tc>
@@ -1838,31 +1760,7 @@
               <w:jc w:val="left"/>
             </w:pPr>
             <w:r>
-              <w:t xml:space="preserve">0</w:t>
-            </w:r>
-          </w:p>
-        </w:tc>
-        <w:tc>
-          <w:tcPr/>
-          <w:p>
-            <w:pPr>
-              <w:pStyle w:val="Compact"/>
-              <w:jc w:val="left"/>
-            </w:pPr>
-            <w:r>
-              <w:t xml:space="preserve">Ignore</w:t>
-            </w:r>
-          </w:p>
-        </w:tc>
-        <w:tc>
-          <w:tcPr/>
-          <w:p>
-            <w:pPr>
-              <w:pStyle w:val="Compact"/>
-              <w:jc w:val="left"/>
-            </w:pPr>
-            <w:r>
-              <w:t xml:space="preserve">No</w:t>
+              <w:t xml:space="preserve">5</w:t>
             </w:r>
           </w:p>
         </w:tc>
@@ -1876,7 +1774,7 @@
               <w:jc w:val="left"/>
             </w:pPr>
             <w:r>
-              <w:t xml:space="preserve">CSAT Survey Portal - Requests page</w:t>
+              <w:t xml:space="preserve">Scripted REST API and resources</w:t>
             </w:r>
           </w:p>
         </w:tc>
@@ -1888,7 +1786,21 @@
               <w:jc w:val="left"/>
             </w:pPr>
             <w:r>
-              <w:t xml:space="preserve">0</w:t>
+              <w:t xml:space="preserve">5</w:t>
+            </w:r>
+          </w:p>
+        </w:tc>
+      </w:tr>
+      <w:tr>
+        <w:tc>
+          <w:tcPr/>
+          <w:p>
+            <w:pPr>
+              <w:pStyle w:val="Compact"/>
+              <w:jc w:val="left"/>
+            </w:pPr>
+            <w:r>
+              <w:t xml:space="preserve">Portal, pages, widgets, menu, layout</w:t>
             </w:r>
           </w:p>
         </w:tc>
@@ -1900,7 +1812,21 @@
               <w:jc w:val="left"/>
             </w:pPr>
             <w:r>
-              <w:t xml:space="preserve">Ignore</w:t>
+              <w:t xml:space="preserve">25</w:t>
+            </w:r>
+          </w:p>
+        </w:tc>
+      </w:tr>
+      <w:tr>
+        <w:tc>
+          <w:tcPr/>
+          <w:p>
+            <w:pPr>
+              <w:pStyle w:val="Compact"/>
+              <w:jc w:val="left"/>
+            </w:pPr>
+            <w:r>
+              <w:t xml:space="preserve">System properties</w:t>
             </w:r>
           </w:p>
         </w:tc>
@@ -1912,7 +1838,33 @@
               <w:jc w:val="left"/>
             </w:pPr>
             <w:r>
-              <w:t xml:space="preserve">No</w:t>
+              <w:t xml:space="preserve">2</w:t>
+            </w:r>
+          </w:p>
+        </w:tc>
+      </w:tr>
+      <w:tr>
+        <w:tc>
+          <w:tcPr/>
+          <w:p>
+            <w:pPr>
+              <w:pStyle w:val="Compact"/>
+              <w:jc w:val="left"/>
+            </w:pPr>
+            <w:r>
+              <w:t xml:space="preserve">Survey definitions, questions, choices</w:t>
+            </w:r>
+          </w:p>
+        </w:tc>
+        <w:tc>
+          <w:tcPr/>
+          <w:p>
+            <w:pPr>
+              <w:pStyle w:val="Compact"/>
+              <w:jc w:val="left"/>
+            </w:pPr>
+            <w:r>
+              <w:t xml:space="preserve">68</w:t>
             </w:r>
           </w:p>
         </w:tc>
@@ -1923,21 +1875,7 @@
         <w:pStyle w:val="BodyText"/>
       </w:pPr>
       <w:r>
-        <w:t xml:space="preserve">The six working sets were consolidated into the COMPLETE set and marked Ignore.</w:t>
-      </w:r>
-      <w:r>
-        <w:t xml:space="preserve"> </w:t>
-      </w:r>
-      <w:r>
-        <w:t xml:space="preserve">They are empty and must not be migrated.</w:t>
-      </w:r>
-    </w:p>
-    <w:p>
-      <w:pPr>
-        <w:pStyle w:val="BodyText"/>
-      </w:pPr>
-      <w:r>
-        <w:t xml:space="preserve">Export:</w:t>
+        <w:t xml:space="preserve">Every other</w:t>
       </w:r>
       <w:r>
         <w:t xml:space="preserve"> </w:t>
@@ -1946,30 +1884,79 @@
         <w:rPr>
           <w:rStyle w:val="VerbatimChar"/>
         </w:rPr>
-        <w:t xml:space="preserve">/export_update_set.do?sysparm_sys_id=b9379cd52b62cf1007a3fa95b891bf80</w:t>
-      </w:r>
-    </w:p>
-    <w:bookmarkStart w:id="28" w:name="why-consolidation-was-needed"/>
+        <w:t xml:space="preserve">CSAT Survey Portal</w:t>
+      </w:r>
+      <w:r>
+        <w:t xml:space="preserve"> </w:t>
+      </w:r>
+      <w:r>
+        <w:t xml:space="preserve">set is now</w:t>
+      </w:r>
+      <w:r>
+        <w:t xml:space="preserve"> </w:t>
+      </w:r>
+      <w:r>
+        <w:rPr>
+          <w:bCs/>
+          <w:b/>
+        </w:rPr>
+        <w:t xml:space="preserve">Ignore</w:t>
+      </w:r>
+      <w:r>
+        <w:t xml:space="preserve">. Their contents are</w:t>
+      </w:r>
+      <w:r>
+        <w:t xml:space="preserve"> </w:t>
+      </w:r>
+      <w:r>
+        <w:t xml:space="preserve">preserved, so setting one back to Complete restores it, but none of them should</w:t>
+      </w:r>
+      <w:r>
+        <w:t xml:space="preserve"> </w:t>
+      </w:r>
+      <w:r>
+        <w:t xml:space="preserve">be migrated — everything they held is in the set above.</w:t>
+      </w:r>
+    </w:p>
+    <w:p>
+      <w:pPr>
+        <w:pStyle w:val="BlockText"/>
+      </w:pPr>
+      <w:r>
+        <w:t xml:space="preserve">The instance also carries older CSAT work belonging to the customer</w:t>
+      </w:r>
+      <w:r>
+        <w:t xml:space="preserve"> </w:t>
+      </w:r>
+      <w:r>
+        <w:t xml:space="preserve">(</w:t>
+      </w:r>
+      <w:r>
+        <w:rPr>
+          <w:rStyle w:val="VerbatimChar"/>
+        </w:rPr>
+        <w:t xml:space="preserve">SE-740_CSAT Survey edits_CC</w:t>
+      </w:r>
+      <w:r>
+        <w:t xml:space="preserve"> </w:t>
+      </w:r>
+      <w:r>
+        <w:t xml:space="preserve">and similar, 14 sets). Those are unrelated to</w:t>
+      </w:r>
+      <w:r>
+        <w:t xml:space="preserve"> </w:t>
+      </w:r>
+      <w:r>
+        <w:t xml:space="preserve">this project and were left alone.</w:t>
+      </w:r>
+    </w:p>
+    <w:bookmarkStart w:id="29" w:name="moving-it"/>
     <w:p>
       <w:pPr>
         <w:pStyle w:val="Heading3"/>
       </w:pPr>
       <w:r>
-        <w:t xml:space="preserve">Why consolidation was needed</w:t>
-      </w:r>
-    </w:p>
-    <w:p>
-      <w:pPr>
-        <w:pStyle w:val="FirstParagraph"/>
-      </w:pPr>
-      <w:r>
-        <w:t xml:space="preserve">Changes are captured against whichever set is current for the deploying user.</w:t>
-      </w:r>
-      <w:r>
-        <w:t xml:space="preserve"> </w:t>
-      </w:r>
-      <w:r>
-        <w:t xml:space="preserve">Two things caused drift across the build:</w:t>
+        <w:t xml:space="preserve">Moving it</w:t>
       </w:r>
     </w:p>
     <w:p>
@@ -1981,13 +1968,31 @@
         <w:pStyle w:val="Compact"/>
       </w:pPr>
       <w:r>
-        <w:t xml:space="preserve">Creating a scoped application switched the current set to that application’s</w:t>
-      </w:r>
-      <w:r>
-        <w:t xml:space="preserve"> </w:t>
-      </w:r>
-      <w:r>
-        <w:t xml:space="preserve">Default, so some changes were captured elsewhere.</w:t>
+        <w:t xml:space="preserve">On the source:</w:t>
+      </w:r>
+      <w:r>
+        <w:t xml:space="preserve"> </w:t>
+      </w:r>
+      <w:r>
+        <w:rPr>
+          <w:bCs/>
+          <w:b/>
+        </w:rPr>
+        <w:t xml:space="preserve">System Update Sets &gt; Local Update Sets &gt;</w:t>
+      </w:r>
+      <w:r>
+        <w:rPr>
+          <w:bCs/>
+          <w:b/>
+        </w:rPr>
+        <w:t xml:space="preserve"> </w:t>
+      </w:r>
+      <w:r>
+        <w:rPr>
+          <w:bCs/>
+          <w:b/>
+        </w:rPr>
+        <w:t xml:space="preserve">CSAT Survey Portal - ALL CHANGES v2.0 &gt; Export to XML</w:t>
       </w:r>
     </w:p>
     <w:p>
@@ -1999,28 +2004,7 @@
         <w:pStyle w:val="Compact"/>
       </w:pPr>
       <w:r>
-        <w:t xml:space="preserve">The latest</w:t>
-      </w:r>
-      <w:r>
-        <w:t xml:space="preserve"> </w:t>
-      </w:r>
-      <w:r>
-        <w:rPr>
-          <w:rStyle w:val="VerbatimChar"/>
-        </w:rPr>
-        <w:t xml:space="preserve">CSATSurveyService</w:t>
-      </w:r>
-      <w:r>
-        <w:t xml:space="preserve"> </w:t>
-      </w:r>
-      <w:r>
-        <w:t xml:space="preserve">— containing the Draft guard and the fix for</w:t>
-      </w:r>
-      <w:r>
-        <w:t xml:space="preserve"> </w:t>
-      </w:r>
-      <w:r>
-        <w:t xml:space="preserve">falsely reported sends — had been captured only into</w:t>
+        <w:t xml:space="preserve">On the target:</w:t>
       </w:r>
       <w:r>
         <w:t xml:space="preserve"> </w:t>
@@ -2030,16 +2014,42 @@
           <w:bCs/>
           <w:b/>
         </w:rPr>
-        <w:t xml:space="preserve">Default</w:t>
-      </w:r>
-      <w:r>
-        <w:t xml:space="preserve">. Migrating</w:t>
-      </w:r>
-      <w:r>
-        <w:t xml:space="preserve"> </w:t>
-      </w:r>
-      <w:r>
-        <w:t xml:space="preserve">the named sets alone would have shipped an older version of the core logic.</w:t>
+        <w:t xml:space="preserve">Retrieved Update Sets &gt; Import Update Set from XML</w:t>
+      </w:r>
+    </w:p>
+    <w:p>
+      <w:pPr>
+        <w:numPr>
+          <w:ilvl w:val="0"/>
+          <w:numId w:val="1003"/>
+        </w:numPr>
+        <w:pStyle w:val="Compact"/>
+      </w:pPr>
+      <w:r>
+        <w:t xml:space="preserve">Open the retrieved set,</w:t>
+      </w:r>
+      <w:r>
+        <w:t xml:space="preserve"> </w:t>
+      </w:r>
+      <w:r>
+        <w:rPr>
+          <w:bCs/>
+          <w:b/>
+        </w:rPr>
+        <w:t xml:space="preserve">Preview</w:t>
+      </w:r>
+      <w:r>
+        <w:t xml:space="preserve">, resolve any collisions, then</w:t>
+      </w:r>
+      <w:r>
+        <w:t xml:space="preserve"> </w:t>
+      </w:r>
+      <w:r>
+        <w:rPr>
+          <w:bCs/>
+          <w:b/>
+        </w:rPr>
+        <w:t xml:space="preserve">Commit</w:t>
       </w:r>
     </w:p>
     <w:p>
@@ -2047,39 +2057,55 @@
         <w:pStyle w:val="FirstParagraph"/>
       </w:pPr>
       <w:r>
+        <w:t xml:space="preserve">Read</w:t>
+      </w:r>
+      <w:r>
+        <w:t xml:space="preserve"> </w:t>
+      </w:r>
+      <w:hyperlink w:anchor="what-does-not-transfer">
+        <w:r>
+          <w:rPr>
+            <w:rStyle w:val="Hyperlink"/>
+          </w:rPr>
+          <w:t xml:space="preserve">what does not transfer</w:t>
+        </w:r>
+      </w:hyperlink>
+      <w:r>
+        <w:t xml:space="preserve"> </w:t>
+      </w:r>
+      <w:r>
+        <w:t xml:space="preserve">first — companies, users,</w:t>
+      </w:r>
+      <w:r>
+        <w:t xml:space="preserve"> </w:t>
+      </w:r>
+      <w:r>
+        <w:t xml:space="preserve">SMTP and</w:t>
+      </w:r>
+      <w:r>
+        <w:t xml:space="preserve"> </w:t>
+      </w:r>
+      <w:r>
         <w:rPr>
           <w:rStyle w:val="VerbatimChar"/>
         </w:rPr>
-        <w:t xml:space="preserve">npm run updateset:adopt</w:t>
-      </w:r>
-      <w:r>
-        <w:t xml:space="preserve"> </w:t>
-      </w:r>
-      <w:r>
-        <w:t xml:space="preserve">and a consolidation pass moved everything into one</w:t>
-      </w:r>
-      <w:r>
-        <w:t xml:space="preserve"> </w:t>
-      </w:r>
-      <w:r>
-        <w:t xml:space="preserve">set. Records for temporary diagnostic REST endpoints were deleted so they</w:t>
-      </w:r>
-      <w:r>
-        <w:t xml:space="preserve"> </w:t>
-      </w:r>
-      <w:r>
-        <w:t xml:space="preserve">cannot be recreated on a target.</w:t>
-      </w:r>
-    </w:p>
-    <w:bookmarkEnd w:id="28"/>
+        <w:t xml:space="preserve">survey.link.whitelabel</w:t>
+      </w:r>
+      <w:r>
+        <w:t xml:space="preserve"> </w:t>
+      </w:r>
+      <w:r>
+        <w:t xml:space="preserve">are instance data and are not in the set.</w:t>
+      </w:r>
+    </w:p>
     <w:bookmarkEnd w:id="29"/>
-    <w:bookmarkStart w:id="30" w:name="promoting-via-the-exported-update-set"/>
-    <w:p>
-      <w:pPr>
-        <w:pStyle w:val="Heading2"/>
-      </w:pPr>
-      <w:r>
-        <w:t xml:space="preserve">Promoting via the exported update set</w:t>
+    <w:bookmarkStart w:id="30" w:name="rebuilding-the-consolidated-set"/>
+    <w:p>
+      <w:pPr>
+        <w:pStyle w:val="Heading3"/>
+      </w:pPr>
+      <w:r>
+        <w:t xml:space="preserve">Rebuilding the consolidated set</w:t>
       </w:r>
     </w:p>
     <w:p>
@@ -2087,13 +2113,130 @@
         <w:pStyle w:val="FirstParagraph"/>
       </w:pPr>
       <w:r>
-        <w:t xml:space="preserve">Once a deployment has been captured, later instances can be done with the XML</w:t>
-      </w:r>
-      <w:r>
-        <w:t xml:space="preserve"> </w:t>
-      </w:r>
-      <w:r>
-        <w:t xml:space="preserve">instead of the scripts:</w:t>
+        <w:t xml:space="preserve">If more changes are made, re-run:</w:t>
+      </w:r>
+    </w:p>
+    <w:p>
+      <w:pPr>
+        <w:pStyle w:val="SourceCode"/>
+      </w:pPr>
+      <w:r>
+        <w:rPr>
+          <w:rStyle w:val="VariableTok"/>
+        </w:rPr>
+        <w:t xml:space="preserve">ENV_FILE</w:t>
+      </w:r>
+      <w:r>
+        <w:rPr>
+          <w:rStyle w:val="OperatorTok"/>
+        </w:rPr>
+        <w:t xml:space="preserve">=</w:t>
+      </w:r>
+      <w:r>
+        <w:rPr>
+          <w:rStyle w:val="NormalTok"/>
+        </w:rPr>
+        <w:t xml:space="preserve">.env.adcom </w:t>
+      </w:r>
+      <w:r>
+        <w:rPr>
+          <w:rStyle w:val="ExtensionTok"/>
+        </w:rPr>
+        <w:t xml:space="preserve">node</w:t>
+      </w:r>
+      <w:r>
+        <w:rPr>
+          <w:rStyle w:val="NormalTok"/>
+        </w:rPr>
+        <w:t xml:space="preserve"> scripts/consolidate-update-set.js </w:t>
+      </w:r>
+      <w:r>
+        <w:rPr>
+          <w:rStyle w:val="AttributeTok"/>
+        </w:rPr>
+        <w:t xml:space="preserve">--dry-run</w:t>
+      </w:r>
+      <w:r>
+        <w:br/>
+      </w:r>
+      <w:r>
+        <w:rPr>
+          <w:rStyle w:val="VariableTok"/>
+        </w:rPr>
+        <w:t xml:space="preserve">ENV_FILE</w:t>
+      </w:r>
+      <w:r>
+        <w:rPr>
+          <w:rStyle w:val="OperatorTok"/>
+        </w:rPr>
+        <w:t xml:space="preserve">=</w:t>
+      </w:r>
+      <w:r>
+        <w:rPr>
+          <w:rStyle w:val="NormalTok"/>
+        </w:rPr>
+        <w:t xml:space="preserve">.env.adcom </w:t>
+      </w:r>
+      <w:r>
+        <w:rPr>
+          <w:rStyle w:val="ExtensionTok"/>
+        </w:rPr>
+        <w:t xml:space="preserve">node</w:t>
+      </w:r>
+      <w:r>
+        <w:rPr>
+          <w:rStyle w:val="NormalTok"/>
+        </w:rPr>
+        <w:t xml:space="preserve"> scripts/consolidate-update-set.js </w:t>
+      </w:r>
+      <w:r>
+        <w:rPr>
+          <w:rStyle w:val="AttributeTok"/>
+        </w:rPr>
+        <w:t xml:space="preserve">--retire-sources</w:t>
+      </w:r>
+    </w:p>
+    <w:p>
+      <w:pPr>
+        <w:pStyle w:val="FirstParagraph"/>
+      </w:pPr>
+      <w:r>
+        <w:t xml:space="preserve">It reads every</w:t>
+      </w:r>
+      <w:r>
+        <w:t xml:space="preserve"> </w:t>
+      </w:r>
+      <w:r>
+        <w:rPr>
+          <w:rStyle w:val="VerbatimChar"/>
+        </w:rPr>
+        <w:t xml:space="preserve">CSAT Survey Portal</w:t>
+      </w:r>
+      <w:r>
+        <w:t xml:space="preserve"> </w:t>
+      </w:r>
+      <w:r>
+        <w:t xml:space="preserve">set, keeps the newest version of each</w:t>
+      </w:r>
+      <w:r>
+        <w:t xml:space="preserve"> </w:t>
+      </w:r>
+      <w:r>
+        <w:t xml:space="preserve">record, and rebuilds the target set from scratch, so it is safe to run</w:t>
+      </w:r>
+      <w:r>
+        <w:t xml:space="preserve"> </w:t>
+      </w:r>
+      <w:r>
+        <w:t xml:space="preserve">repeatedly. Source sets are only read, never emptied.</w:t>
+      </w:r>
+    </w:p>
+    <w:p>
+      <w:pPr>
+        <w:pStyle w:val="BodyText"/>
+      </w:pPr>
+      <w:r>
+        <w:t xml:space="preserve">Three kinds of entry are deliberately left out:</w:t>
       </w:r>
     </w:p>
     <w:p>
@@ -2105,31 +2248,29 @@
         <w:pStyle w:val="Compact"/>
       </w:pPr>
       <w:r>
-        <w:t xml:space="preserve">Export from the source:</w:t>
-      </w:r>
-      <w:r>
-        <w:t xml:space="preserve"> </w:t>
-      </w:r>
-      <w:r>
         <w:rPr>
           <w:bCs/>
           <w:b/>
         </w:rPr>
-        <w:t xml:space="preserve">System Update Sets &gt; Local Update Sets &gt;</w:t>
-      </w:r>
-      <w:r>
-        <w:rPr>
-          <w:bCs/>
-          <w:b/>
-        </w:rPr>
-        <w:t xml:space="preserve"> </w:t>
-      </w:r>
-      <w:r>
-        <w:rPr>
-          <w:bCs/>
-          <w:b/>
-        </w:rPr>
-        <w:t xml:space="preserve">CSAT Survey Portal &gt; Export to XML</w:t>
+        <w:t xml:space="preserve">Superseded portal layout.</w:t>
+      </w:r>
+      <w:r>
+        <w:t xml:space="preserve"> </w:t>
+      </w:r>
+      <w:r>
+        <w:t xml:space="preserve">Placing a widget on a page deletes and recreates</w:t>
+      </w:r>
+      <w:r>
+        <w:t xml:space="preserve"> </w:t>
+      </w:r>
+      <w:r>
+        <w:t xml:space="preserve">the containers, rows and columns, so each re-deploy left a delete behind for</w:t>
+      </w:r>
+      <w:r>
+        <w:t xml:space="preserve"> </w:t>
+      </w:r>
+      <w:r>
+        <w:t xml:space="preserve">the previous generation. Those records only ever existed on this instance.</w:t>
       </w:r>
     </w:p>
     <w:p>
@@ -2141,17 +2282,17 @@
         <w:pStyle w:val="Compact"/>
       </w:pPr>
       <w:r>
-        <w:t xml:space="preserve">On the target:</w:t>
-      </w:r>
-      <w:r>
-        <w:t xml:space="preserve"> </w:t>
-      </w:r>
-      <w:r>
         <w:rPr>
           <w:bCs/>
           <w:b/>
         </w:rPr>
-        <w:t xml:space="preserve">Retrieved Update Sets &gt; Import Update Set from XML</w:t>
+        <w:t xml:space="preserve">Temporary diagnostic endpoints</w:t>
+      </w:r>
+      <w:r>
+        <w:t xml:space="preserve"> </w:t>
+      </w:r>
+      <w:r>
+        <w:t xml:space="preserve">created while debugging.</w:t>
       </w:r>
     </w:p>
     <w:p>
@@ -2163,7 +2304,20 @@
         <w:pStyle w:val="Compact"/>
       </w:pPr>
       <w:r>
-        <w:t xml:space="preserve">Preview, then Commit</w:t>
+        <w:rPr>
+          <w:bCs/>
+          <w:b/>
+        </w:rPr>
+        <w:t xml:space="preserve">Records that no longer exist here</w:t>
+      </w:r>
+      <w:r>
+        <w:t xml:space="preserve">, which would otherwise be recreated on</w:t>
+      </w:r>
+      <w:r>
+        <w:t xml:space="preserve"> </w:t>
+      </w:r>
+      <w:r>
+        <w:t xml:space="preserve">the target.</w:t>
       </w:r>
     </w:p>
     <w:p>
@@ -2171,7 +2325,10 @@
         <w:pStyle w:val="FirstParagraph"/>
       </w:pPr>
       <w:r>
-        <w:t xml:space="preserve">The scheduled job (</w:t>
+        <w:t xml:space="preserve">The scheduled job needs the opposite treatment. ServiceNow treats</w:t>
+      </w:r>
+      <w:r>
+        <w:t xml:space="preserve"> </w:t>
       </w:r>
       <w:r>
         <w:rPr>
@@ -2180,13 +2337,16 @@
         <w:t xml:space="preserve">sysauto_script</w:t>
       </w:r>
       <w:r>
-        <w:t xml:space="preserve">) is data rather than metadata and is not</w:t>
-      </w:r>
-      <w:r>
-        <w:t xml:space="preserve"> </w:t>
-      </w:r>
-      <w:r>
-        <w:t xml:space="preserve">captured in update sets, so re-create it on the target by running</w:t>
+        <w:t xml:space="preserve"> </w:t>
+      </w:r>
+      <w:r>
+        <w:t xml:space="preserve">as data, so editing it is never captured; the script pushes it</w:t>
+      </w:r>
+      <w:r>
+        <w:t xml:space="preserve"> </w:t>
+      </w:r>
+      <w:r>
+        <w:t xml:space="preserve">in through</w:t>
       </w:r>
       <w:r>
         <w:t xml:space="preserve"> </w:t>
@@ -2195,14 +2355,137 @@
         <w:rPr>
           <w:rStyle w:val="VerbatimChar"/>
         </w:rPr>
-        <w:t xml:space="preserve">deploy-csat-app.js</w:t>
-      </w:r>
-      <w:r>
-        <w:t xml:space="preserve">, or add the record manually.</w:t>
+        <w:t xml:space="preserve">GlideUpdateManager2</w:t>
+      </w:r>
+      <w:r>
+        <w:t xml:space="preserve">, the same API behind the</w:t>
+      </w:r>
+      <w:r>
+        <w:t xml:space="preserve"> </w:t>
+      </w:r>
+      <w:r>
+        <w:rPr>
+          <w:bCs/>
+          <w:b/>
+        </w:rPr>
+        <w:t xml:space="preserve">Add to Update Set</w:t>
+      </w:r>
+      <w:r>
+        <w:t xml:space="preserve"> </w:t>
+      </w:r>
+      <w:r>
+        <w:t xml:space="preserve">action. Without that step the 30 and 60-day schedules would never run on the</w:t>
+      </w:r>
+      <w:r>
+        <w:t xml:space="preserve"> </w:t>
+      </w:r>
+      <w:r>
+        <w:t xml:space="preserve">target.</w:t>
       </w:r>
     </w:p>
     <w:bookmarkEnd w:id="30"/>
+    <w:bookmarkStart w:id="31" w:name="why-consolidation-was-needed"/>
+    <w:p>
+      <w:pPr>
+        <w:pStyle w:val="Heading3"/>
+      </w:pPr>
+      <w:r>
+        <w:t xml:space="preserve">Why consolidation was needed</w:t>
+      </w:r>
+    </w:p>
+    <w:p>
+      <w:pPr>
+        <w:pStyle w:val="FirstParagraph"/>
+      </w:pPr>
+      <w:r>
+        <w:t xml:space="preserve">Changes are captured against whichever set is current for the deploying user,</w:t>
+      </w:r>
+      <w:r>
+        <w:t xml:space="preserve"> </w:t>
+      </w:r>
+      <w:r>
+        <w:t xml:space="preserve">and the work ran across a dozen sets as it was built. Two things also caused</w:t>
+      </w:r>
+      <w:r>
+        <w:t xml:space="preserve"> </w:t>
+      </w:r>
+      <w:r>
+        <w:t xml:space="preserve">drift:</w:t>
+      </w:r>
+    </w:p>
+    <w:p>
+      <w:pPr>
+        <w:numPr>
+          <w:ilvl w:val="0"/>
+          <w:numId w:val="1005"/>
+        </w:numPr>
+        <w:pStyle w:val="Compact"/>
+      </w:pPr>
+      <w:r>
+        <w:t xml:space="preserve">Creating a scoped application switched the current set to that application’s</w:t>
+      </w:r>
+      <w:r>
+        <w:t xml:space="preserve"> </w:t>
+      </w:r>
+      <w:r>
+        <w:t xml:space="preserve">Default, so some changes were captured elsewhere.</w:t>
+      </w:r>
+    </w:p>
+    <w:p>
+      <w:pPr>
+        <w:numPr>
+          <w:ilvl w:val="0"/>
+          <w:numId w:val="1005"/>
+        </w:numPr>
+        <w:pStyle w:val="Compact"/>
+      </w:pPr>
+      <w:r>
+        <w:t xml:space="preserve">The latest</w:t>
+      </w:r>
+      <w:r>
+        <w:t xml:space="preserve"> </w:t>
+      </w:r>
+      <w:r>
+        <w:rPr>
+          <w:rStyle w:val="VerbatimChar"/>
+        </w:rPr>
+        <w:t xml:space="preserve">CSATSurveyService</w:t>
+      </w:r>
+      <w:r>
+        <w:t xml:space="preserve"> </w:t>
+      </w:r>
+      <w:r>
+        <w:t xml:space="preserve">— containing the Draft guard and the fix for</w:t>
+      </w:r>
+      <w:r>
+        <w:t xml:space="preserve"> </w:t>
+      </w:r>
+      <w:r>
+        <w:t xml:space="preserve">falsely reported sends — had at one point been captured only into</w:t>
+      </w:r>
+      <w:r>
+        <w:t xml:space="preserve"> </w:t>
+      </w:r>
+      <w:r>
+        <w:rPr>
+          <w:bCs/>
+          <w:b/>
+        </w:rPr>
+        <w:t xml:space="preserve">Default</w:t>
+      </w:r>
+      <w:r>
+        <w:t xml:space="preserve">,</w:t>
+      </w:r>
+      <w:r>
+        <w:t xml:space="preserve"> </w:t>
+      </w:r>
+      <w:r>
+        <w:t xml:space="preserve">so migrating the named sets alone would have shipped older core logic.</w:t>
+      </w:r>
+    </w:p>
     <w:bookmarkEnd w:id="31"/>
+    <w:bookmarkEnd w:id="32"/>
+    <w:bookmarkEnd w:id="33"/>
     <w:sectPr/>
   </w:body>
 </w:document>
@@ -2507,9 +2790,6 @@
     <w:abstractNumId w:val="991"/>
   </w:num>
   <w:num w:numId="1003">
-    <w:abstractNumId w:val="991"/>
-  </w:num>
-  <w:num w:numId="1004">
     <w:abstractNumId w:val="99411"/>
     <w:lvlOverride w:ilvl="0">
       <w:startOverride w:val="1"/>
@@ -2538,6 +2818,12 @@
     <w:lvlOverride w:ilvl="8">
       <w:startOverride w:val="1"/>
     </w:lvlOverride>
+  </w:num>
+  <w:num w:numId="1004">
+    <w:abstractNumId w:val="991"/>
+  </w:num>
+  <w:num w:numId="1005">
+    <w:abstractNumId w:val="991"/>
   </w:num>
 </w:numbering>
 </file>

</xml_diff>

<commit_message>
Carry only what is in use into the consolidated update set
Drops anything whose final state is a deletion, the survey questions retired
across two rounds of changes, and the records that no longer exist here.

The retired questions were deactivated rather than deleted on this instance
because answers recorded against them during testing would have gone with
them. A target has no such history, so it should receive only the two
questions each survey asks.

Source discovery no longer filters on state, or a re-run after --retire-sources
would find nothing to read.

117 entries, down from 179.

Co-authored-by: paladuguraj <paladuguraj@users.noreply.github.com>
</commit_message>
<xml_diff>
--- a/docs/CSAT Survey Portal - Migration Runbook.docx
+++ b/docs/CSAT Survey Portal - Migration Runbook.docx
@@ -1443,22 +1443,23 @@
       </w:pPr>
       <w:r>
         <w:rPr>
+          <w:rStyle w:val="VerbatimChar"/>
           <w:bCs/>
           <w:b/>
         </w:rPr>
-        <w:t xml:space="preserve">REST API base URI</w:t>
-      </w:r>
-      <w:r>
-        <w:t xml:space="preserve"> </w:t>
-      </w:r>
-      <w:r>
-        <w:t xml:space="preserve">— ServiceNow assigns the namespace per instance, so the</w:t>
-      </w:r>
-      <w:r>
-        <w:t xml:space="preserve"> </w:t>
-      </w:r>
-      <w:r>
-        <w:t xml:space="preserve">path differs (for example</w:t>
+        <w:t xml:space="preserve">CSAT Test Probe</w:t>
+      </w:r>
+      <w:r>
+        <w:t xml:space="preserve"> </w:t>
+      </w:r>
+      <w:r>
+        <w:t xml:space="preserve">— a Scripted REST API used only by the check scripts to</w:t>
+      </w:r>
+      <w:r>
+        <w:t xml:space="preserve"> </w:t>
+      </w:r>
+      <w:r>
+        <w:t xml:space="preserve">call server-side code. It is created on demand by</w:t>
       </w:r>
       <w:r>
         <w:t xml:space="preserve"> </w:t>
@@ -1467,16 +1468,16 @@
         <w:rPr>
           <w:rStyle w:val="VerbatimChar"/>
         </w:rPr>
-        <w:t xml:space="preserve">/api/2114022/csat_survey_api</w:t>
-      </w:r>
-      <w:r>
-        <w:t xml:space="preserve">). Scripts read it from</w:t>
-      </w:r>
-      <w:r>
-        <w:t xml:space="preserve"> </w:t>
-      </w:r>
-      <w:r>
-        <w:t xml:space="preserve">the API definition rather than hardcoding it.</w:t>
+        <w:t xml:space="preserve">scripts/lib/probe.js</w:t>
+      </w:r>
+      <w:r>
+        <w:t xml:space="preserve">, is</w:t>
+      </w:r>
+      <w:r>
+        <w:t xml:space="preserve"> </w:t>
+      </w:r>
+      <w:r>
+        <w:t xml:space="preserve">not part of the solution, and is deliberately excluded from the set</w:t>
       </w:r>
     </w:p>
     <w:bookmarkEnd w:id="27"/>
@@ -1528,7 +1529,7 @@
         <w:pStyle w:val="BlockText"/>
       </w:pPr>
       <w:r>
-        <w:t xml:space="preserve">179 changes ·</w:t>
+        <w:t xml:space="preserve">117 changes ·</w:t>
       </w:r>
       <w:r>
         <w:t xml:space="preserve"> </w:t>
@@ -1545,31 +1546,31 @@
         <w:pStyle w:val="FirstParagraph"/>
       </w:pPr>
       <w:r>
-        <w:t xml:space="preserve">It holds the whole solution as it stands: the portal and its three pages and</w:t>
-      </w:r>
-      <w:r>
-        <w:t xml:space="preserve"> </w:t>
-      </w:r>
-      <w:r>
-        <w:t xml:space="preserve">widgets, the three tables with their columns, labels and choice lists, the four</w:t>
-      </w:r>
-      <w:r>
-        <w:t xml:space="preserve"> </w:t>
-      </w:r>
-      <w:r>
-        <w:t xml:space="preserve">script includes, both business rules, the scheduled job, the event and</w:t>
-      </w:r>
-      <w:r>
-        <w:t xml:space="preserve"> </w:t>
-      </w:r>
-      <w:r>
-        <w:t xml:space="preserve">notifications, the mail scripts, the Scripted REST API, and both survey</w:t>
-      </w:r>
-      <w:r>
-        <w:t xml:space="preserve"> </w:t>
-      </w:r>
-      <w:r>
-        <w:t xml:space="preserve">definitions with their questions and answer choices.</w:t>
+        <w:t xml:space="preserve">It holds the solution as it stands and nothing else: the portal and its three</w:t>
+      </w:r>
+      <w:r>
+        <w:t xml:space="preserve"> </w:t>
+      </w:r>
+      <w:r>
+        <w:t xml:space="preserve">pages and widgets, the three tables with their columns, labels and choice</w:t>
+      </w:r>
+      <w:r>
+        <w:t xml:space="preserve"> </w:t>
+      </w:r>
+      <w:r>
+        <w:t xml:space="preserve">lists, the three script includes, both business rules, the scheduled job, the</w:t>
+      </w:r>
+      <w:r>
+        <w:t xml:space="preserve"> </w:t>
+      </w:r>
+      <w:r>
+        <w:t xml:space="preserve">event and notifications, the mail scripts, and both survey definitions with the</w:t>
+      </w:r>
+      <w:r>
+        <w:t xml:space="preserve"> </w:t>
+      </w:r>
+      <w:r>
+        <w:t xml:space="preserve">two questions each actually asks.</w:t>
       </w:r>
     </w:p>
     <w:tbl>
@@ -1630,7 +1631,7 @@
               <w:jc w:val="left"/>
             </w:pPr>
             <w:r>
-              <w:t xml:space="preserve">57</w:t>
+              <w:t xml:space="preserve">53</w:t>
             </w:r>
           </w:p>
         </w:tc>
@@ -1656,7 +1657,7 @@
               <w:jc w:val="left"/>
             </w:pPr>
             <w:r>
-              <w:t xml:space="preserve">4</w:t>
+              <w:t xml:space="preserve">3</w:t>
             </w:r>
           </w:p>
         </w:tc>
@@ -1760,7 +1761,7 @@
               <w:jc w:val="left"/>
             </w:pPr>
             <w:r>
-              <w:t xml:space="preserve">5</w:t>
+              <w:t xml:space="preserve">3</w:t>
             </w:r>
           </w:p>
         </w:tc>
@@ -1774,7 +1775,7 @@
               <w:jc w:val="left"/>
             </w:pPr>
             <w:r>
-              <w:t xml:space="preserve">Scripted REST API and resources</w:t>
+              <w:t xml:space="preserve">Portal, pages, widgets, menu, layout</w:t>
             </w:r>
           </w:p>
         </w:tc>
@@ -1786,7 +1787,7 @@
               <w:jc w:val="left"/>
             </w:pPr>
             <w:r>
-              <w:t xml:space="preserve">5</w:t>
+              <w:t xml:space="preserve">25</w:t>
             </w:r>
           </w:p>
         </w:tc>
@@ -1800,7 +1801,7 @@
               <w:jc w:val="left"/>
             </w:pPr>
             <w:r>
-              <w:t xml:space="preserve">Portal, pages, widgets, menu, layout</w:t>
+              <w:t xml:space="preserve">System properties</w:t>
             </w:r>
           </w:p>
         </w:tc>
@@ -1812,7 +1813,7 @@
               <w:jc w:val="left"/>
             </w:pPr>
             <w:r>
-              <w:t xml:space="preserve">25</w:t>
+              <w:t xml:space="preserve">2</w:t>
             </w:r>
           </w:p>
         </w:tc>
@@ -1826,7 +1827,7 @@
               <w:jc w:val="left"/>
             </w:pPr>
             <w:r>
-              <w:t xml:space="preserve">System properties</w:t>
+              <w:t xml:space="preserve">Survey definitions, questions, choices</w:t>
             </w:r>
           </w:p>
         </w:tc>
@@ -1838,38 +1839,26 @@
               <w:jc w:val="left"/>
             </w:pPr>
             <w:r>
-              <w:t xml:space="preserve">2</w:t>
-            </w:r>
-          </w:p>
-        </w:tc>
-      </w:tr>
-      <w:tr>
-        <w:tc>
-          <w:tcPr/>
-          <w:p>
-            <w:pPr>
-              <w:pStyle w:val="Compact"/>
-              <w:jc w:val="left"/>
-            </w:pPr>
-            <w:r>
-              <w:t xml:space="preserve">Survey definitions, questions, choices</w:t>
-            </w:r>
-          </w:p>
-        </w:tc>
-        <w:tc>
-          <w:tcPr/>
-          <w:p>
-            <w:pPr>
-              <w:pStyle w:val="Compact"/>
-              <w:jc w:val="left"/>
-            </w:pPr>
-            <w:r>
-              <w:t xml:space="preserve">68</w:t>
+              <w:t xml:space="preserve">18</w:t>
             </w:r>
           </w:p>
         </w:tc>
       </w:tr>
     </w:tbl>
+    <w:p>
+      <w:pPr>
+        <w:pStyle w:val="BodyText"/>
+      </w:pPr>
+      <w:r>
+        <w:t xml:space="preserve">Every entry is an insert or update of a record that exists and is in use. There</w:t>
+      </w:r>
+      <w:r>
+        <w:t xml:space="preserve"> </w:t>
+      </w:r>
+      <w:r>
+        <w:t xml:space="preserve">are no deletions and no superseded artefacts.</w:t>
+      </w:r>
+    </w:p>
     <w:p>
       <w:pPr>
         <w:pStyle w:val="BodyText"/>
@@ -2236,7 +2225,13 @@
         <w:pStyle w:val="BodyText"/>
       </w:pPr>
       <w:r>
-        <w:t xml:space="preserve">Three kinds of entry are deliberately left out:</w:t>
+        <w:t xml:space="preserve">The build went through several changes of direction, and the sets captured</w:t>
+      </w:r>
+      <w:r>
+        <w:t xml:space="preserve"> </w:t>
+      </w:r>
+      <w:r>
+        <w:t xml:space="preserve">every step. These are left out so the target receives only what is in use:</w:t>
       </w:r>
     </w:p>
     <w:p>
@@ -2252,25 +2247,159 @@
           <w:bCs/>
           <w:b/>
         </w:rPr>
-        <w:t xml:space="preserve">Superseded portal layout.</w:t>
-      </w:r>
-      <w:r>
-        <w:t xml:space="preserve"> </w:t>
-      </w:r>
-      <w:r>
-        <w:t xml:space="preserve">Placing a widget on a page deletes and recreates</w:t>
-      </w:r>
-      <w:r>
-        <w:t xml:space="preserve"> </w:t>
-      </w:r>
-      <w:r>
-        <w:t xml:space="preserve">the containers, rows and columns, so each re-deploy left a delete behind for</w:t>
-      </w:r>
-      <w:r>
-        <w:t xml:space="preserve"> </w:t>
-      </w:r>
-      <w:r>
-        <w:t xml:space="preserve">the previous generation. Those records only ever existed on this instance.</w:t>
+        <w:t xml:space="preserve">Anything whose final state is a deletion.</w:t>
+      </w:r>
+      <w:r>
+        <w:t xml:space="preserve"> </w:t>
+      </w:r>
+      <w:r>
+        <w:t xml:space="preserve">The record does not exist here,</w:t>
+      </w:r>
+      <w:r>
+        <w:t xml:space="preserve"> </w:t>
+      </w:r>
+      <w:r>
+        <w:t xml:space="preserve">and on a fresh target there is nothing to delete. This covers the portal</w:t>
+      </w:r>
+      <w:r>
+        <w:t xml:space="preserve"> </w:t>
+      </w:r>
+      <w:r>
+        <w:t xml:space="preserve">layout churn (placing a widget deletes and recreates the containers, rows and</w:t>
+      </w:r>
+      <w:r>
+        <w:t xml:space="preserve"> </w:t>
+      </w:r>
+      <w:r>
+        <w:t xml:space="preserve">columns, so each re-deploy left a delete behind), the orphaned choice lists</w:t>
+      </w:r>
+      <w:r>
+        <w:t xml:space="preserve"> </w:t>
+      </w:r>
+      <w:r>
+        <w:t xml:space="preserve">from the</w:t>
+      </w:r>
+      <w:r>
+        <w:t xml:space="preserve"> </w:t>
+      </w:r>
+      <w:r>
+        <w:rPr>
+          <w:rStyle w:val="VerbatimChar"/>
+        </w:rPr>
+        <w:t xml:space="preserve">u_</w:t>
+      </w:r>
+      <w:r>
+        <w:t xml:space="preserve">-prefix defect, and the two mail scripts that were superseded by</w:t>
+      </w:r>
+      <w:r>
+        <w:t xml:space="preserve"> </w:t>
+      </w:r>
+      <w:r>
+        <w:t xml:space="preserve">extending the customer’s own.</w:t>
+      </w:r>
+    </w:p>
+    <w:p>
+      <w:pPr>
+        <w:numPr>
+          <w:ilvl w:val="0"/>
+          <w:numId w:val="1004"/>
+        </w:numPr>
+        <w:pStyle w:val="Compact"/>
+      </w:pPr>
+      <w:r>
+        <w:rPr>
+          <w:bCs/>
+          <w:b/>
+        </w:rPr>
+        <w:t xml:space="preserve">Superseded survey questions.</w:t>
+      </w:r>
+      <w:r>
+        <w:t xml:space="preserve"> </w:t>
+      </w:r>
+      <w:r>
+        <w:t xml:space="preserve">The surveys started with five questions,</w:t>
+      </w:r>
+      <w:r>
+        <w:t xml:space="preserve"> </w:t>
+      </w:r>
+      <w:r>
+        <w:t xml:space="preserve">then one, then two. The retired questions were deactivated rather than</w:t>
+      </w:r>
+      <w:r>
+        <w:t xml:space="preserve"> </w:t>
+      </w:r>
+      <w:r>
+        <w:t xml:space="preserve">deleted here, because answers recorded against them during testing would have</w:t>
+      </w:r>
+      <w:r>
+        <w:t xml:space="preserve"> </w:t>
+      </w:r>
+      <w:r>
+        <w:t xml:space="preserve">gone with them. A target has no such history, so it receives only the two</w:t>
+      </w:r>
+      <w:r>
+        <w:t xml:space="preserve"> </w:t>
+      </w:r>
+      <w:r>
+        <w:t xml:space="preserve">questions each survey asks and their answer choices.</w:t>
+      </w:r>
+    </w:p>
+    <w:p>
+      <w:pPr>
+        <w:numPr>
+          <w:ilvl w:val="0"/>
+          <w:numId w:val="1004"/>
+        </w:numPr>
+        <w:pStyle w:val="Compact"/>
+      </w:pPr>
+      <w:r>
+        <w:rPr>
+          <w:bCs/>
+          <w:b/>
+        </w:rPr>
+        <w:t xml:space="preserve">The original UI Page build.</w:t>
+      </w:r>
+      <w:r>
+        <w:t xml:space="preserve"> </w:t>
+      </w:r>
+      <w:r>
+        <w:rPr>
+          <w:rStyle w:val="VerbatimChar"/>
+        </w:rPr>
+        <w:t xml:space="preserve">CSATSurveyAjax</w:t>
+      </w:r>
+      <w:r>
+        <w:t xml:space="preserve"> </w:t>
+      </w:r>
+      <w:r>
+        <w:t xml:space="preserve">and the</w:t>
+      </w:r>
+      <w:r>
+        <w:t xml:space="preserve"> </w:t>
+      </w:r>
+      <w:r>
+        <w:rPr>
+          <w:rStyle w:val="VerbatimChar"/>
+        </w:rPr>
+        <w:t xml:space="preserve">CSAT Survey API</w:t>
+      </w:r>
+      <w:r>
+        <w:t xml:space="preserve"> </w:t>
+      </w:r>
+      <w:r>
+        <w:t xml:space="preserve">with its four resources served the first implementation, which was replaced</w:t>
+      </w:r>
+      <w:r>
+        <w:t xml:space="preserve"> </w:t>
+      </w:r>
+      <w:r>
+        <w:t xml:space="preserve">by the Service Portal. Nothing referenced them any more, so they were deleted</w:t>
+      </w:r>
+      <w:r>
+        <w:t xml:space="preserve"> </w:t>
+      </w:r>
+      <w:r>
+        <w:t xml:space="preserve">from the instance and the repository as well as from the set.</w:t>
       </w:r>
     </w:p>
     <w:p>

</xml_diff>

<commit_message>
Keep the dated change set usable alongside the migration set
Retiring every source set also retired the set holding this round of changes,
which is the one an instance already running the solution would want. --keep
exempts named sets from being marked Ignore.

Co-authored-by: paladuguraj <paladuguraj@users.noreply.github.com>
</commit_message>
<xml_diff>
--- a/docs/CSAT Survey Portal - Migration Runbook.docx
+++ b/docs/CSAT Survey Portal - Migration Runbook.docx
@@ -28,7 +28,7 @@
         </w:p>
       </w:sdtContent>
     </w:sdt>
-    <w:bookmarkStart w:id="33" w:name="X47d3ed5a99bd92b08e0bc22d12ab79240fbfc78"/>
+    <w:bookmarkStart w:id="34" w:name="X47d3ed5a99bd92b08e0bc22d12ab79240fbfc78"/>
     <w:p>
       <w:pPr>
         <w:pStyle w:val="Heading1"/>
@@ -1481,7 +1481,7 @@
       </w:r>
     </w:p>
     <w:bookmarkEnd w:id="27"/>
-    <w:bookmarkStart w:id="32" w:name="the-update-set-to-move"/>
+    <w:bookmarkStart w:id="33" w:name="the-update-set-to-move"/>
     <w:p>
       <w:pPr>
         <w:pStyle w:val="Heading2"/>
@@ -1529,7 +1529,7 @@
         <w:pStyle w:val="BlockText"/>
       </w:pPr>
       <w:r>
-        <w:t xml:space="preserve">117 changes ·</w:t>
+        <w:t xml:space="preserve">118 changes ·</w:t>
       </w:r>
       <w:r>
         <w:t xml:space="preserve"> </w:t>
@@ -1775,7 +1775,7 @@
               <w:jc w:val="left"/>
             </w:pPr>
             <w:r>
-              <w:t xml:space="preserve">Portal, pages, widgets, menu, layout</w:t>
+              <w:t xml:space="preserve">Portal, pages, widgets, menu, layout, theme</w:t>
             </w:r>
           </w:p>
         </w:tc>
@@ -1787,7 +1787,7 @@
               <w:jc w:val="left"/>
             </w:pPr>
             <w:r>
-              <w:t xml:space="preserve">25</w:t>
+              <w:t xml:space="preserve">26</w:t>
             </w:r>
           </w:p>
         </w:tc>
@@ -1864,6 +1864,79 @@
         <w:pStyle w:val="BodyText"/>
       </w:pPr>
       <w:r>
+        <w:t xml:space="preserve">One other set is deliberately left in Complete state:</w:t>
+      </w:r>
+    </w:p>
+    <w:p>
+      <w:pPr>
+        <w:pStyle w:val="Heading3"/>
+      </w:pPr>
+      <w:bookmarkStart w:id="29" w:name="Xa1cb88075341c7f28e9babf56a8e828d0b18b35"/>
+      <w:r>
+        <w:t xml:space="preserve">CSAT Survey Portal - Rebrand and survey intro</w:t>
+      </w:r>
+      <w:bookmarkEnd w:id="29"/>
+    </w:p>
+    <w:p>
+      <w:pPr>
+        <w:pStyle w:val="BlockText"/>
+      </w:pPr>
+      <w:r>
+        <w:t xml:space="preserve">6 changes · the portal rename and</w:t>
+      </w:r>
+      <w:r>
+        <w:t xml:space="preserve"> </w:t>
+      </w:r>
+      <w:r>
+        <w:rPr>
+          <w:rStyle w:val="VerbatimChar"/>
+        </w:rPr>
+        <w:t xml:space="preserve">#011B58</w:t>
+      </w:r>
+      <w:r>
+        <w:t xml:space="preserve"> </w:t>
+      </w:r>
+      <w:r>
+        <w:t xml:space="preserve">header, its dedicated theme, the</w:t>
+      </w:r>
+      <w:r>
+        <w:t xml:space="preserve"> </w:t>
+      </w:r>
+      <w:r>
+        <w:t xml:space="preserve">Generic Schedule Survey rename and the two surveys skipping their Get Started</w:t>
+      </w:r>
+      <w:r>
+        <w:t xml:space="preserve"> </w:t>
+      </w:r>
+      <w:r>
+        <w:t xml:space="preserve">page</w:t>
+      </w:r>
+    </w:p>
+    <w:p>
+      <w:pPr>
+        <w:pStyle w:val="FirstParagraph"/>
+      </w:pPr>
+      <w:r>
+        <w:t xml:space="preserve">That is a delta, for an instance that already runs the solution and only needs</w:t>
+      </w:r>
+      <w:r>
+        <w:t xml:space="preserve"> </w:t>
+      </w:r>
+      <w:r>
+        <w:t xml:space="preserve">this round of changes. Everything in it is also in the full set above, so apply</w:t>
+      </w:r>
+      <w:r>
+        <w:t xml:space="preserve"> </w:t>
+      </w:r>
+      <w:r>
+        <w:t xml:space="preserve">one or the other, not both.</w:t>
+      </w:r>
+    </w:p>
+    <w:p>
+      <w:pPr>
+        <w:pStyle w:val="BodyText"/>
+      </w:pPr>
+      <w:r>
         <w:t xml:space="preserve">Every other</w:t>
       </w:r>
       <w:r>
@@ -1879,7 +1952,7 @@
         <w:t xml:space="preserve"> </w:t>
       </w:r>
       <w:r>
-        <w:t xml:space="preserve">set is now</w:t>
+        <w:t xml:space="preserve">set is</w:t>
       </w:r>
       <w:r>
         <w:t xml:space="preserve"> </w:t>
@@ -1904,7 +1977,7 @@
         <w:t xml:space="preserve"> </w:t>
       </w:r>
       <w:r>
-        <w:t xml:space="preserve">be migrated — everything they held is in the set above.</w:t>
+        <w:t xml:space="preserve">be migrated — everything they held is in the full set.</w:t>
       </w:r>
     </w:p>
     <w:p>
@@ -1939,7 +2012,7 @@
         <w:t xml:space="preserve">this project and were left alone.</w:t>
       </w:r>
     </w:p>
-    <w:bookmarkStart w:id="29" w:name="moving-it"/>
+    <w:bookmarkStart w:id="30" w:name="moving-it"/>
     <w:p>
       <w:pPr>
         <w:pStyle w:val="Heading3"/>
@@ -2087,8 +2160,8 @@
         <w:t xml:space="preserve">are instance data and are not in the set.</w:t>
       </w:r>
     </w:p>
-    <w:bookmarkEnd w:id="29"/>
-    <w:bookmarkStart w:id="30" w:name="rebuilding-the-consolidated-set"/>
+    <w:bookmarkEnd w:id="30"/>
+    <w:bookmarkStart w:id="31" w:name="rebuilding-the-consolidated-set"/>
     <w:p>
       <w:pPr>
         <w:pStyle w:val="Heading3"/>
@@ -2183,6 +2256,45 @@
           <w:rStyle w:val="AttributeTok"/>
         </w:rPr>
         <w:t xml:space="preserve">--retire-sources</w:t>
+      </w:r>
+      <w:r>
+        <w:rPr>
+          <w:rStyle w:val="NormalTok"/>
+        </w:rPr>
+        <w:t xml:space="preserve"> </w:t>
+      </w:r>
+      <w:r>
+        <w:rPr>
+          <w:rStyle w:val="DataTypeTok"/>
+        </w:rPr>
+        <w:t xml:space="preserve">\</w:t>
+      </w:r>
+      <w:r>
+        <w:br/>
+      </w:r>
+      <w:r>
+        <w:rPr>
+          <w:rStyle w:val="NormalTok"/>
+        </w:rPr>
+        <w:t xml:space="preserve">  </w:t>
+      </w:r>
+      <w:r>
+        <w:rPr>
+          <w:rStyle w:val="AttributeTok"/>
+        </w:rPr>
+        <w:t xml:space="preserve">--keep</w:t>
+      </w:r>
+      <w:r>
+        <w:rPr>
+          <w:rStyle w:val="NormalTok"/>
+        </w:rPr>
+        <w:t xml:space="preserve"> </w:t>
+      </w:r>
+      <w:r>
+        <w:rPr>
+          <w:rStyle w:val="StringTok"/>
+        </w:rPr>
+        <w:t xml:space="preserve">"CSAT Survey Portal - Rebrand and survey intro"</w:t>
       </w:r>
     </w:p>
     <w:p>
@@ -2512,8 +2624,8 @@
         <w:t xml:space="preserve">target.</w:t>
       </w:r>
     </w:p>
-    <w:bookmarkEnd w:id="30"/>
-    <w:bookmarkStart w:id="31" w:name="why-consolidation-was-needed"/>
+    <w:bookmarkEnd w:id="31"/>
+    <w:bookmarkStart w:id="32" w:name="why-consolidation-was-needed"/>
     <w:p>
       <w:pPr>
         <w:pStyle w:val="Heading3"/>
@@ -2612,9 +2724,9 @@
         <w:t xml:space="preserve">so migrating the named sets alone would have shipped older core logic.</w:t>
       </w:r>
     </w:p>
-    <w:bookmarkEnd w:id="31"/>
     <w:bookmarkEnd w:id="32"/>
     <w:bookmarkEnd w:id="33"/>
+    <w:bookmarkEnd w:id="34"/>
     <w:sectPr/>
   </w:body>
 </w:document>

</xml_diff>

<commit_message>
Split the consolidated update set by application scope
Committing failed on the target with "Update scope id ... is different than
update set scope id 'global'". One entry, the guard on Survey Assigned
Notification, belongs to the Service Portal Surveys store app, and an update
set can only hold changes from its own scope.

The guard cannot be dropped, or that stock notification fires for portal
surveys too and the recipient gets two invitations. It also cannot be avoided
by disabling the platform notification on these surveys: both have active
trigger conditions on sn_customerservice_case, so they are raised by the case
flow as well, and filtering on trigger_table is what separates the two paths.

Consolidation now groups entries by scope and builds one set per scope, so this
cannot recur if another scoped record is ever touched.

Co-authored-by: paladuguraj <paladuguraj@users.noreply.github.com>
</commit_message>
<xml_diff>
--- a/docs/CSAT Survey Portal - Migration Runbook.docx
+++ b/docs/CSAT Survey Portal - Migration Runbook.docx
@@ -28,7 +28,7 @@
         </w:p>
       </w:sdtContent>
     </w:sdt>
-    <w:bookmarkStart w:id="34" w:name="X47d3ed5a99bd92b08e0bc22d12ab79240fbfc78"/>
+    <w:bookmarkStart w:id="35" w:name="X47d3ed5a99bd92b08e0bc22d12ab79240fbfc78"/>
     <w:p>
       <w:pPr>
         <w:pStyle w:val="Heading1"/>
@@ -1481,7 +1481,7 @@
       </w:r>
     </w:p>
     <w:bookmarkEnd w:id="27"/>
-    <w:bookmarkStart w:id="33" w:name="the-update-set-to-move"/>
+    <w:bookmarkStart w:id="34" w:name="the-update-set-to-move"/>
     <w:p>
       <w:pPr>
         <w:pStyle w:val="Heading2"/>
@@ -1495,7 +1495,25 @@
         <w:pStyle w:val="FirstParagraph"/>
       </w:pPr>
       <w:r>
-        <w:t xml:space="preserve">There is one, and it is the only CSAT Survey Portal set left in</w:t>
+        <w:t xml:space="preserve">Two, and they must both be committed, in this order.</w:t>
+      </w:r>
+    </w:p>
+    <w:p>
+      <w:pPr>
+        <w:pStyle w:val="Heading3"/>
+      </w:pPr>
+      <w:bookmarkStart w:id="28" w:name="csat-survey-portal---all-changes-v2.0"/>
+      <w:r>
+        <w:t xml:space="preserve">1. CSAT Survey Portal - ALL CHANGES v2.0</w:t>
+      </w:r>
+      <w:bookmarkEnd w:id="28"/>
+    </w:p>
+    <w:p>
+      <w:pPr>
+        <w:pStyle w:val="BlockText"/>
+      </w:pPr>
+      <w:r>
+        <w:t xml:space="preserve">117 changes · scope</w:t>
       </w:r>
       <w:r>
         <w:t xml:space="preserve"> </w:t>
@@ -1505,31 +1523,56 @@
           <w:bCs/>
           <w:b/>
         </w:rPr>
-        <w:t xml:space="preserve">Complete</w:t>
-      </w:r>
-      <w:r>
-        <w:t xml:space="preserve"> </w:t>
-      </w:r>
-      <w:r>
-        <w:t xml:space="preserve">state on adcomsolutionsdev:</w:t>
+        <w:t xml:space="preserve">global</w:t>
+      </w:r>
+      <w:r>
+        <w:t xml:space="preserve"> </w:t>
+      </w:r>
+      <w:r>
+        <w:t xml:space="preserve">·</w:t>
+      </w:r>
+      <w:r>
+        <w:t xml:space="preserve"> </w:t>
+      </w:r>
+      <w:r>
+        <w:rPr>
+          <w:rStyle w:val="VerbatimChar"/>
+        </w:rPr>
+        <w:t xml:space="preserve">cdf1ea853b7a8750c4e908ac24e45a64</w:t>
       </w:r>
     </w:p>
     <w:p>
       <w:pPr>
         <w:pStyle w:val="Heading3"/>
       </w:pPr>
-      <w:bookmarkStart w:id="28" w:name="csat-survey-portal---all-changes-v2.0"/>
-      <w:r>
-        <w:t xml:space="preserve">CSAT Survey Portal - ALL CHANGES v2.0</w:t>
-      </w:r>
-      <w:bookmarkEnd w:id="28"/>
+      <w:bookmarkStart w:id="29" w:name="X7c3b7de0e7376715e39f2e9c504eb9585a7ef00"/>
+      <w:r>
+        <w:t xml:space="preserve">2. CSAT Survey Portal - ALL CHANGES v2.0 (sn_portal_surveys)</w:t>
+      </w:r>
+      <w:bookmarkEnd w:id="29"/>
     </w:p>
     <w:p>
       <w:pPr>
         <w:pStyle w:val="BlockText"/>
       </w:pPr>
       <w:r>
-        <w:t xml:space="preserve">118 changes ·</w:t>
+        <w:t xml:space="preserve">1 change · scope</w:t>
+      </w:r>
+      <w:r>
+        <w:t xml:space="preserve"> </w:t>
+      </w:r>
+      <w:r>
+        <w:rPr>
+          <w:bCs/>
+          <w:b/>
+        </w:rPr>
+        <w:t xml:space="preserve">sn_portal_surveys</w:t>
+      </w:r>
+      <w:r>
+        <w:t xml:space="preserve"> </w:t>
+      </w:r>
+      <w:r>
+        <w:t xml:space="preserve">·</w:t>
       </w:r>
       <w:r>
         <w:t xml:space="preserve"> </w:t>
@@ -1538,7 +1581,7 @@
         <w:rPr>
           <w:rStyle w:val="VerbatimChar"/>
         </w:rPr>
-        <w:t xml:space="preserve">cdf1ea853b7a8750c4e908ac24e45a64</w:t>
+        <w:t xml:space="preserve">af789f582b4f435007a3fa95b891bf66</w:t>
       </w:r>
     </w:p>
     <w:p>
@@ -1546,31 +1589,198 @@
         <w:pStyle w:val="FirstParagraph"/>
       </w:pPr>
       <w:r>
-        <w:t xml:space="preserve">It holds the solution as it stands and nothing else: the portal and its three</w:t>
-      </w:r>
-      <w:r>
-        <w:t xml:space="preserve"> </w:t>
-      </w:r>
-      <w:r>
-        <w:t xml:space="preserve">pages and widgets, the three tables with their columns, labels and choice</w:t>
-      </w:r>
-      <w:r>
-        <w:t xml:space="preserve"> </w:t>
-      </w:r>
-      <w:r>
-        <w:t xml:space="preserve">lists, the three script includes, both business rules, the scheduled job, the</w:t>
-      </w:r>
-      <w:r>
-        <w:t xml:space="preserve"> </w:t>
-      </w:r>
-      <w:r>
-        <w:t xml:space="preserve">event and notifications, the mail scripts, and both survey definitions with the</w:t>
-      </w:r>
-      <w:r>
-        <w:t xml:space="preserve"> </w:t>
-      </w:r>
-      <w:r>
-        <w:t xml:space="preserve">two questions each actually asks.</w:t>
+        <w:t xml:space="preserve">They are split because</w:t>
+      </w:r>
+      <w:r>
+        <w:t xml:space="preserve"> </w:t>
+      </w:r>
+      <w:r>
+        <w:rPr>
+          <w:bCs/>
+          <w:b/>
+        </w:rPr>
+        <w:t xml:space="preserve">an update set can only hold changes from its own</w:t>
+      </w:r>
+      <w:r>
+        <w:rPr>
+          <w:bCs/>
+          <w:b/>
+        </w:rPr>
+        <w:t xml:space="preserve"> </w:t>
+      </w:r>
+      <w:r>
+        <w:rPr>
+          <w:bCs/>
+          <w:b/>
+        </w:rPr>
+        <w:t xml:space="preserve">application scope</w:t>
+      </w:r>
+      <w:r>
+        <w:t xml:space="preserve">. Committing a global set that contains a scoped record</w:t>
+      </w:r>
+      <w:r>
+        <w:t xml:space="preserve"> </w:t>
+      </w:r>
+      <w:r>
+        <w:t xml:space="preserve">fails with:</w:t>
+      </w:r>
+    </w:p>
+    <w:p>
+      <w:pPr>
+        <w:pStyle w:val="SourceCode"/>
+      </w:pPr>
+      <w:r>
+        <w:rPr>
+          <w:rStyle w:val="VerbatimChar"/>
+        </w:rPr>
+        <w:t xml:space="preserve">Update scope id '67ac5062db10220035417878f0b8f5c4' is different than</w:t>
+      </w:r>
+      <w:r>
+        <w:br/>
+      </w:r>
+      <w:r>
+        <w:rPr>
+          <w:rStyle w:val="VerbatimChar"/>
+        </w:rPr>
+        <w:t xml:space="preserve">update set scope id 'global'. Resolve the problem before committing.</w:t>
+      </w:r>
+    </w:p>
+    <w:p>
+      <w:pPr>
+        <w:pStyle w:val="FirstParagraph"/>
+      </w:pPr>
+      <w:r>
+        <w:t xml:space="preserve">The one scoped change is a condition added to</w:t>
+      </w:r>
+      <w:r>
+        <w:t xml:space="preserve"> </w:t>
+      </w:r>
+      <w:r>
+        <w:rPr>
+          <w:bCs/>
+          <w:b/>
+        </w:rPr>
+        <w:t xml:space="preserve">Survey Assigned Notification</w:t>
+      </w:r>
+      <w:r>
+        <w:t xml:space="preserve">,</w:t>
+      </w:r>
+      <w:r>
+        <w:t xml:space="preserve"> </w:t>
+      </w:r>
+      <w:r>
+        <w:t xml:space="preserve">which belongs to the Service Portal Surveys store app. Without it that stock</w:t>
+      </w:r>
+      <w:r>
+        <w:t xml:space="preserve"> </w:t>
+      </w:r>
+      <w:r>
+        <w:t xml:space="preserve">notification also fires for portal-raised surveys and the recipient receives</w:t>
+      </w:r>
+      <w:r>
+        <w:t xml:space="preserve"> </w:t>
+      </w:r>
+      <w:r>
+        <w:t xml:space="preserve">two invitations. It cannot simply be dropped, and it cannot be made global: it</w:t>
+      </w:r>
+      <w:r>
+        <w:t xml:space="preserve"> </w:t>
+      </w:r>
+      <w:r>
+        <w:t xml:space="preserve">edits a record the store app owns.</w:t>
+      </w:r>
+    </w:p>
+    <w:p>
+      <w:pPr>
+        <w:pStyle w:val="BlockText"/>
+      </w:pPr>
+      <w:r>
+        <w:t xml:space="preserve">It also cannot be avoided by turning off the platform invitation on these</w:t>
+      </w:r>
+      <w:r>
+        <w:t xml:space="preserve"> </w:t>
+      </w:r>
+      <w:r>
+        <w:t xml:space="preserve">surveys. Both Complex Resolution Survey and Generic Schedule Survey have</w:t>
+      </w:r>
+      <w:r>
+        <w:t xml:space="preserve"> </w:t>
+      </w:r>
+      <w:r>
+        <w:t xml:space="preserve">active trigger conditions on</w:t>
+      </w:r>
+      <w:r>
+        <w:t xml:space="preserve"> </w:t>
+      </w:r>
+      <w:r>
+        <w:rPr>
+          <w:rStyle w:val="VerbatimChar"/>
+        </w:rPr>
+        <w:t xml:space="preserve">sn_customerservice_case</w:t>
+      </w:r>
+      <w:r>
+        <w:t xml:space="preserve">, so they are raised by</w:t>
+      </w:r>
+      <w:r>
+        <w:t xml:space="preserve"> </w:t>
+      </w:r>
+      <w:r>
+        <w:t xml:space="preserve">the case flow as well as by the portal; suppressing their platform</w:t>
+      </w:r>
+      <w:r>
+        <w:t xml:space="preserve"> </w:t>
+      </w:r>
+      <w:r>
+        <w:t xml:space="preserve">notification would stop the case-triggered invitations too. Filtering on</w:t>
+      </w:r>
+      <w:r>
+        <w:t xml:space="preserve"> </w:t>
+      </w:r>
+      <w:r>
+        <w:rPr>
+          <w:rStyle w:val="VerbatimChar"/>
+        </w:rPr>
+        <w:t xml:space="preserve">trigger_table</w:t>
+      </w:r>
+      <w:r>
+        <w:t xml:space="preserve"> </w:t>
+      </w:r>
+      <w:r>
+        <w:t xml:space="preserve">is what keeps the two paths apart.</w:t>
+      </w:r>
+    </w:p>
+    <w:p>
+      <w:pPr>
+        <w:pStyle w:val="FirstParagraph"/>
+      </w:pPr>
+      <w:r>
+        <w:t xml:space="preserve">The global set holds everything else:</w:t>
+      </w:r>
+    </w:p>
+    <w:p>
+      <w:pPr>
+        <w:pStyle w:val="BodyText"/>
+      </w:pPr>
+      <w:r>
+        <w:t xml:space="preserve">the portal and its three pages and widgets, the three tables with their</w:t>
+      </w:r>
+      <w:r>
+        <w:t xml:space="preserve"> </w:t>
+      </w:r>
+      <w:r>
+        <w:t xml:space="preserve">columns, labels and choice lists, the three script includes, both business</w:t>
+      </w:r>
+      <w:r>
+        <w:t xml:space="preserve"> </w:t>
+      </w:r>
+      <w:r>
+        <w:t xml:space="preserve">rules, the scheduled job, the event and notifications, the mail scripts, and</w:t>
+      </w:r>
+      <w:r>
+        <w:t xml:space="preserve"> </w:t>
+      </w:r>
+      <w:r>
+        <w:t xml:space="preserve">both survey definitions with the two questions each actually asks.</w:t>
       </w:r>
     </w:p>
     <w:tbl>
@@ -1735,7 +1945,7 @@
               <w:jc w:val="left"/>
             </w:pPr>
             <w:r>
-              <w:t xml:space="preserve">7</w:t>
+              <w:t xml:space="preserve">6</w:t>
             </w:r>
           </w:p>
         </w:tc>
@@ -1871,11 +2081,11 @@
       <w:pPr>
         <w:pStyle w:val="Heading3"/>
       </w:pPr>
-      <w:bookmarkStart w:id="29" w:name="Xa1cb88075341c7f28e9babf56a8e828d0b18b35"/>
+      <w:bookmarkStart w:id="30" w:name="Xa1cb88075341c7f28e9babf56a8e828d0b18b35"/>
       <w:r>
         <w:t xml:space="preserve">CSAT Survey Portal - Rebrand and survey intro</w:t>
       </w:r>
-      <w:bookmarkEnd w:id="29"/>
+      <w:bookmarkEnd w:id="30"/>
     </w:p>
     <w:p>
       <w:pPr>
@@ -2012,13 +2222,37 @@
         <w:t xml:space="preserve">this project and were left alone.</w:t>
       </w:r>
     </w:p>
-    <w:bookmarkStart w:id="30" w:name="moving-it"/>
+    <w:bookmarkStart w:id="31" w:name="moving-it"/>
     <w:p>
       <w:pPr>
         <w:pStyle w:val="Heading3"/>
       </w:pPr>
       <w:r>
         <w:t xml:space="preserve">Moving it</w:t>
+      </w:r>
+    </w:p>
+    <w:p>
+      <w:pPr>
+        <w:pStyle w:val="FirstParagraph"/>
+      </w:pPr>
+      <w:r>
+        <w:t xml:space="preserve">Repeat these steps for</w:t>
+      </w:r>
+      <w:r>
+        <w:t xml:space="preserve"> </w:t>
+      </w:r>
+      <w:r>
+        <w:rPr>
+          <w:bCs/>
+          <w:b/>
+        </w:rPr>
+        <w:t xml:space="preserve">both</w:t>
+      </w:r>
+      <w:r>
+        <w:t xml:space="preserve"> </w:t>
+      </w:r>
+      <w:r>
+        <w:t xml:space="preserve">sets, global first:</w:t>
       </w:r>
     </w:p>
     <w:p>
@@ -2051,10 +2285,26 @@
       </w:r>
       <w:r>
         <w:rPr>
+          <w:iCs/>
+          <w:i/>
           <w:bCs/>
           <w:b/>
         </w:rPr>
-        <w:t xml:space="preserve">CSAT Survey Portal - ALL CHANGES v2.0 &gt; Export to XML</w:t>
+        <w:t xml:space="preserve">the set</w:t>
+      </w:r>
+      <w:r>
+        <w:rPr>
+          <w:bCs/>
+          <w:b/>
+        </w:rPr>
+        <w:t xml:space="preserve"> </w:t>
+      </w:r>
+      <w:r>
+        <w:rPr>
+          <w:bCs/>
+          <w:b/>
+        </w:rPr>
+        <w:t xml:space="preserve">&gt; Export to XML</w:t>
       </w:r>
     </w:p>
     <w:p>
@@ -2117,6 +2367,26 @@
     <w:p>
       <w:pPr>
         <w:pStyle w:val="FirstParagraph"/>
+      </w:pPr>
+      <w:r>
+        <w:t xml:space="preserve">The Service Portal Surveys app must be present on the target before the scoped</w:t>
+      </w:r>
+      <w:r>
+        <w:t xml:space="preserve"> </w:t>
+      </w:r>
+      <w:r>
+        <w:t xml:space="preserve">set will commit. If the two invitations are acceptable for a first pass, the</w:t>
+      </w:r>
+      <w:r>
+        <w:t xml:space="preserve"> </w:t>
+      </w:r>
+      <w:r>
+        <w:t xml:space="preserve">global set works on its own and the scoped one can follow.</w:t>
+      </w:r>
+    </w:p>
+    <w:p>
+      <w:pPr>
+        <w:pStyle w:val="BodyText"/>
       </w:pPr>
       <w:r>
         <w:t xml:space="preserve">Read</w:t>
@@ -2160,8 +2430,8 @@
         <w:t xml:space="preserve">are instance data and are not in the set.</w:t>
       </w:r>
     </w:p>
-    <w:bookmarkEnd w:id="30"/>
-    <w:bookmarkStart w:id="31" w:name="rebuilding-the-consolidated-set"/>
+    <w:bookmarkEnd w:id="31"/>
+    <w:bookmarkStart w:id="32" w:name="rebuilding-the-consolidated-set"/>
     <w:p>
       <w:pPr>
         <w:pStyle w:val="Heading3"/>
@@ -2624,8 +2894,8 @@
         <w:t xml:space="preserve">target.</w:t>
       </w:r>
     </w:p>
-    <w:bookmarkEnd w:id="31"/>
-    <w:bookmarkStart w:id="32" w:name="why-consolidation-was-needed"/>
+    <w:bookmarkEnd w:id="32"/>
+    <w:bookmarkStart w:id="33" w:name="why-consolidation-was-needed"/>
     <w:p>
       <w:pPr>
         <w:pStyle w:val="Heading3"/>
@@ -2724,9 +2994,9 @@
         <w:t xml:space="preserve">so migrating the named sets alone would have shipped older core logic.</w:t>
       </w:r>
     </w:p>
-    <w:bookmarkEnd w:id="32"/>
     <w:bookmarkEnd w:id="33"/>
     <w:bookmarkEnd w:id="34"/>
+    <w:bookmarkEnd w:id="35"/>
     <w:sectPr/>
   </w:body>
 </w:document>

</xml_diff>